<commit_message>
Add CRM localisation tooling to the record, Kraken and BVNK CVs
Records that she implemented API tooling to translate CRM communications
into local languages, raising email open rate 10%.

Added to the Kraken CV, where the JD names both multi-market and
multi-language delivery and CRM or lifecycle messaging workflows, and to
the BVNK CV, where customer communications is an entire JD section.

Her original wording was "translate localized CRM comms", which doubles
up since localising is the translating; noted in the record.

Both variants still render to one page.

Co-Authored-By: Claude Opus 5 <noreply@anthropic.com>
Claude-Session: https://claude.ai/code/session_01Qg3JRFT9ga3f5zZUMD22tQ
</commit_message>
<xml_diff>
--- a/dist/Jessie-Chan-CV-bvnk-pmm.docx
+++ b/dist/Jessie-Chan-CV-bvnk-pmm.docx
@@ -200,6 +200,28 @@
           <w:szCs w:val="20"/>
         </w:rPr>
         <w:t xml:space="preserve">Automated daily reporting with Claude Code, cutting 30 min/day of manual work, and partnered with Data Engineering and Security to publish it as an internal dashboard; built MCP and API integrations and internal bots to remove repeat manual work across the team</w:t>
+      </w:r>
+    </w:p>
+    <w:p>
+      <w:pPr>
+        <w:pStyle w:val="ListParagraph"/>
+        <w:numPr>
+          <w:ilvl w:val="0"/>
+          <w:numId w:val="2"/>
+        </w:numPr>
+        <w:spacing w:after="50"/>
+      </w:pPr>
+      <w:r>
+        <w:rPr>
+          <w:rFonts w:ascii="Calibri" w:cs="Calibri" w:eastAsia="Calibri" w:hAnsi="Calibri"/>
+          <w:b w:val="false"/>
+          <w:bCs w:val="false"/>
+          <w:i w:val="false"/>
+          <w:iCs w:val="false"/>
+          <w:sz w:val="20"/>
+          <w:szCs w:val="20"/>
+        </w:rPr>
+        <w:t xml:space="preserve">Implemented API tools to translate CRM communications into local languages, increasing email open rate by 10%</w:t>
       </w:r>
     </w:p>
     <w:p>

</xml_diff>

<commit_message>
Rewrite BVNK CV in the Kraken and Plasma register
Verb, what, numbers, with no explanatory subclauses. Bullets follow the
JD's order: customer insights, communications, adoption, then systems.
The 3 Wealth clients now lead the outreach bullet. Stablecoin is not
claimed, since no recorded work backs it. Verified at one page.

Co-Authored-By: Claude Opus 5.5 <noreply@anthropic.com>
Claude-Session: https://claude.ai/code/session_01Qg3JRGKeFtCXXeV9rGpzwA
</commit_message>
<xml_diff>
--- a/dist/Jessie-Chan-CV-bvnk-pmm.docx
+++ b/dist/Jessie-Chan-CV-bvnk-pmm.docx
@@ -52,7 +52,7 @@
           <w:sz w:val="20"/>
           <w:szCs w:val="20"/>
         </w:rPr>
-        <w:t xml:space="preserve">Crypto and stablecoin marketer across retail, wealth and institutional products, working in a regulated environment with Compliance, Product and Engineering. I use AI to solve go-to-market problems, building the automation, reporting and research workflows teams run on rather than one-off content. Hands-on with customer research, segmentation and competitive analysis, with a data-science research background. Multilingual, currently developing market entry for a new product line in Malaysia.</w:t>
+        <w:t xml:space="preserve">Crypto marketer working across retail, wealth and institutional products, focused on customer research, regulated customer communications and AI automation. I have run research across 3 customer segments, written and reviewed customer-facing messaging with Compliance across UK, US and EU markets, and built the reporting and automation workflows the team runs on. I use Claude Code and Cursor daily and build MCP and API integrations. Data-science research background, working in 4 languages.</w:t>
       </w:r>
     </w:p>
     <w:p>
@@ -155,7 +155,7 @@
           <w:sz w:val="20"/>
           <w:szCs w:val="20"/>
         </w:rPr>
-        <w:t xml:space="preserve">Designed and ran a segmented customer research programme across 3 customer segments, returning 114 responses, and turned the findings into positioning and campaign priorities</w:t>
+        <w:t xml:space="preserve">Designed and ran a customer survey across 3 customer segments, returning 114 responses at a 14% response rate</w:t>
       </w:r>
     </w:p>
     <w:p>
@@ -177,7 +177,7 @@
           <w:sz w:val="20"/>
           <w:szCs w:val="20"/>
         </w:rPr>
-        <w:t xml:space="preserve">Built an outreach channel of 80 crypto publishers for high net worth client acquisition that sourced 3 major clients, plus a 100-operator database for institutional business development</w:t>
+        <w:t xml:space="preserve">Sourced 3 major Wealth clients through an outreach channel of 80 crypto publishers, and built a 100-operator database for Institutional business development</w:t>
       </w:r>
     </w:p>
     <w:p>
@@ -199,7 +199,7 @@
           <w:sz w:val="20"/>
           <w:szCs w:val="20"/>
         </w:rPr>
-        <w:t xml:space="preserve">Automated daily reporting with Claude Code, cutting 30 min/day of manual work, and partnered with Data Engineering and Security to publish it as an internal dashboard; built MCP and API integrations and internal bots to remove repeat manual work across the team</w:t>
+        <w:t xml:space="preserve">Implemented API tools to translate CRM communications into local languages, increasing email open rate by 10%</w:t>
       </w:r>
     </w:p>
     <w:p>
@@ -221,7 +221,7 @@
           <w:sz w:val="20"/>
           <w:szCs w:val="20"/>
         </w:rPr>
-        <w:t xml:space="preserve">Implemented API tools to translate CRM communications into local languages, increasing email open rate by 10%</w:t>
+        <w:t xml:space="preserve">Developed and reviewed regulated customer-facing messaging across all retail products and 20 app-store storefronts in UK, US and EU markets</w:t>
       </w:r>
     </w:p>
     <w:p>
@@ -243,7 +243,7 @@
           <w:sz w:val="20"/>
           <w:szCs w:val="20"/>
         </w:rPr>
-        <w:t xml:space="preserve">Developing go-to-market for the loans product in Malaysia: market and competitor review, brand and tone, channel opportunity assessment, and KOL, affiliate and referral partnerships</w:t>
+        <w:t xml:space="preserve">Partnered with Front-End Engineering to ship refreshed Personal and Earn product pages across jurisdictions</w:t>
       </w:r>
     </w:p>
     <w:p>
@@ -265,7 +265,7 @@
           <w:sz w:val="20"/>
           <w:szCs w:val="20"/>
         </w:rPr>
-        <w:t xml:space="preserve">Set customer-facing content standards across 20 app-store storefronts and reviewed regulated messaging across all retail products with Compliance, covering UK, US and EU jurisdictions</w:t>
+        <w:t xml:space="preserve">Developing go-to-market for the loans product in Malaysia, covering competitor review, brand and tone, and KOL, affiliate and referral partnerships</w:t>
       </w:r>
     </w:p>
     <w:p>
@@ -287,7 +287,7 @@
           <w:sz w:val="20"/>
           <w:szCs w:val="20"/>
         </w:rPr>
-        <w:t xml:space="preserve">Built an AI-powered UGC production workflow from scratch, delivering 100+ video assets and cutting production time by 75%, establishing an in-house capability the team did not previously have</w:t>
+        <w:t xml:space="preserve">Automated daily reporting with Claude Code and Cursor, cutting 30 min/day of manual work, and partnered with Data Engineering and Security to publish it as an internal dashboard</w:t>
       </w:r>
     </w:p>
     <w:p>
@@ -309,68 +309,7 @@
           <w:sz w:val="20"/>
           <w:szCs w:val="20"/>
         </w:rPr>
-        <w:t xml:space="preserve">Ran paid acquisition across 5 channels and 26 markets, using 128 structured tests to direct budget and cut CPI on UK campaigns by 21.5% while installs increased 30.2%</w:t>
-      </w:r>
-    </w:p>
-    <w:p>
-      <w:pPr>
-        <w:tabs>
-          <w:tab w:val="right" w:pos="10466"/>
-        </w:tabs>
-        <w:spacing w:after="10" w:before="100"/>
-      </w:pPr>
-      <w:r>
-        <w:rPr>
-          <w:rFonts w:ascii="Calibri" w:cs="Calibri" w:eastAsia="Calibri" w:hAnsi="Calibri"/>
-          <w:b/>
-          <w:bCs/>
-          <w:i w:val="false"/>
-          <w:iCs w:val="false"/>
-          <w:sz w:val="20"/>
-          <w:szCs w:val="20"/>
-        </w:rPr>
-        <w:t xml:space="preserve">Performance Marketer</w:t>
-      </w:r>
-      <w:r>
-        <w:rPr>
-          <w:rFonts w:ascii="Calibri" w:cs="Calibri" w:eastAsia="Calibri" w:hAnsi="Calibri"/>
-          <w:b w:val="false"/>
-          <w:bCs w:val="false"/>
-          <w:i w:val="false"/>
-          <w:iCs w:val="false"/>
-          <w:sz w:val="20"/>
-          <w:szCs w:val="20"/>
-        </w:rPr>
-        <w:t xml:space="preserve">	</w:t>
-      </w:r>
-      <w:r>
-        <w:rPr>
-          <w:rFonts w:ascii="Calibri" w:cs="Calibri" w:eastAsia="Calibri" w:hAnsi="Calibri"/>
-          <w:b/>
-          <w:bCs/>
-          <w:i w:val="false"/>
-          <w:iCs w:val="false"/>
-          <w:sz w:val="20"/>
-          <w:szCs w:val="20"/>
-        </w:rPr>
-        <w:t xml:space="preserve">Feb 2025 – Apr 2026</w:t>
-      </w:r>
-    </w:p>
-    <w:p>
-      <w:pPr>
-        <w:spacing w:after="60"/>
-      </w:pPr>
-      <w:r>
-        <w:rPr>
-          <w:rFonts w:ascii="Calibri" w:cs="Calibri" w:eastAsia="Calibri" w:hAnsi="Calibri"/>
-          <w:b w:val="false"/>
-          <w:bCs w:val="false"/>
-          <w:i/>
-          <w:iCs/>
-          <w:sz w:val="20"/>
-          <w:szCs w:val="20"/>
-        </w:rPr>
-        <w:t xml:space="preserve">Malaberg, London, United Kingdom</w:t>
+        <w:t xml:space="preserve">Built MCP and API integrations and internal bots to remove repeat manual work across the team</w:t>
       </w:r>
     </w:p>
     <w:p>
@@ -392,7 +331,7 @@
           <w:sz w:val="20"/>
           <w:szCs w:val="20"/>
         </w:rPr>
-        <w:t xml:space="preserve">Led weekly content reviews with Compliance, setting the standard for regulated consumer-finance messaging across every customer-facing channel</w:t>
+        <w:t xml:space="preserve">Developed an AI-powered UGC production workflow, delivering 100+ video assets and cutting production time by 75%</w:t>
       </w:r>
     </w:p>
     <w:p>
@@ -414,7 +353,68 @@
           <w:sz w:val="20"/>
           <w:szCs w:val="20"/>
         </w:rPr>
-        <w:t xml:space="preserve">Built a company-wide automated reporting pipeline on lead conversion, cutting daily report preparation from 30 min to almost immediate output</w:t>
+        <w:t xml:space="preserve">Ran 128 structured campaign tests across 26 markets, reallocating budget away from 26 underperforming campaigns</w:t>
+      </w:r>
+    </w:p>
+    <w:p>
+      <w:pPr>
+        <w:tabs>
+          <w:tab w:val="right" w:pos="10466"/>
+        </w:tabs>
+        <w:spacing w:after="10" w:before="100"/>
+      </w:pPr>
+      <w:r>
+        <w:rPr>
+          <w:rFonts w:ascii="Calibri" w:cs="Calibri" w:eastAsia="Calibri" w:hAnsi="Calibri"/>
+          <w:b/>
+          <w:bCs/>
+          <w:i w:val="false"/>
+          <w:iCs w:val="false"/>
+          <w:sz w:val="20"/>
+          <w:szCs w:val="20"/>
+        </w:rPr>
+        <w:t xml:space="preserve">Performance Marketer</w:t>
+      </w:r>
+      <w:r>
+        <w:rPr>
+          <w:rFonts w:ascii="Calibri" w:cs="Calibri" w:eastAsia="Calibri" w:hAnsi="Calibri"/>
+          <w:b w:val="false"/>
+          <w:bCs w:val="false"/>
+          <w:i w:val="false"/>
+          <w:iCs w:val="false"/>
+          <w:sz w:val="20"/>
+          <w:szCs w:val="20"/>
+        </w:rPr>
+        <w:t xml:space="preserve">	</w:t>
+      </w:r>
+      <w:r>
+        <w:rPr>
+          <w:rFonts w:ascii="Calibri" w:cs="Calibri" w:eastAsia="Calibri" w:hAnsi="Calibri"/>
+          <w:b/>
+          <w:bCs/>
+          <w:i w:val="false"/>
+          <w:iCs w:val="false"/>
+          <w:sz w:val="20"/>
+          <w:szCs w:val="20"/>
+        </w:rPr>
+        <w:t xml:space="preserve">Feb 2025 – Apr 2026</w:t>
+      </w:r>
+    </w:p>
+    <w:p>
+      <w:pPr>
+        <w:spacing w:after="60"/>
+      </w:pPr>
+      <w:r>
+        <w:rPr>
+          <w:rFonts w:ascii="Calibri" w:cs="Calibri" w:eastAsia="Calibri" w:hAnsi="Calibri"/>
+          <w:b w:val="false"/>
+          <w:bCs w:val="false"/>
+          <w:i/>
+          <w:iCs/>
+          <w:sz w:val="20"/>
+          <w:szCs w:val="20"/>
+        </w:rPr>
+        <w:t xml:space="preserve">Malaberg, London, United Kingdom</w:t>
       </w:r>
     </w:p>
     <w:p>
@@ -436,7 +436,7 @@
           <w:sz w:val="20"/>
           <w:szCs w:val="20"/>
         </w:rPr>
-        <w:t xml:space="preserve">Increased daily conversions from 10 to 50+ (5x) by rebuilding landing and promotional pages in Figma and Photoshop, informed by funnel analysis in Power BI, Excel and Microsoft Clarity, increasing funnel progression by 5%</w:t>
+        <w:t xml:space="preserve">Led weekly content reviews with Compliance to clear regulated consumer-finance messaging across all channels</w:t>
       </w:r>
     </w:p>
     <w:p>
@@ -458,7 +458,51 @@
           <w:sz w:val="20"/>
           <w:szCs w:val="20"/>
         </w:rPr>
-        <w:t xml:space="preserve">Managed £50k+ monthly paid budget with full accountability for efficiency, sustaining 120% ROAS</w:t>
+        <w:t xml:space="preserve">Built a company-wide automated reporting pipeline on lead conversion, cutting daily report preparation from 30+ min to almost immediate output</w:t>
+      </w:r>
+    </w:p>
+    <w:p>
+      <w:pPr>
+        <w:pStyle w:val="ListParagraph"/>
+        <w:numPr>
+          <w:ilvl w:val="0"/>
+          <w:numId w:val="2"/>
+        </w:numPr>
+        <w:spacing w:after="50"/>
+      </w:pPr>
+      <w:r>
+        <w:rPr>
+          <w:rFonts w:ascii="Calibri" w:cs="Calibri" w:eastAsia="Calibri" w:hAnsi="Calibri"/>
+          <w:b w:val="false"/>
+          <w:bCs w:val="false"/>
+          <w:i w:val="false"/>
+          <w:iCs w:val="false"/>
+          <w:sz w:val="20"/>
+          <w:szCs w:val="20"/>
+        </w:rPr>
+        <w:t xml:space="preserve">Increased daily conversions from 10 to 50+ (5x) by rebuilding landing and promotional pages in Figma and Photoshop, informed by funnel analysis in Power BI, Excel and Microsoft Clarity</w:t>
+      </w:r>
+    </w:p>
+    <w:p>
+      <w:pPr>
+        <w:pStyle w:val="ListParagraph"/>
+        <w:numPr>
+          <w:ilvl w:val="0"/>
+          <w:numId w:val="2"/>
+        </w:numPr>
+        <w:spacing w:after="50"/>
+      </w:pPr>
+      <w:r>
+        <w:rPr>
+          <w:rFonts w:ascii="Calibri" w:cs="Calibri" w:eastAsia="Calibri" w:hAnsi="Calibri"/>
+          <w:b w:val="false"/>
+          <w:bCs w:val="false"/>
+          <w:i w:val="false"/>
+          <w:iCs w:val="false"/>
+          <w:sz w:val="20"/>
+          <w:szCs w:val="20"/>
+        </w:rPr>
+        <w:t xml:space="preserve">Managed £50k+ monthly paid budget managing ads and conversion funnels, sustaining 120% ROAS</w:t>
       </w:r>
     </w:p>
     <w:p>
@@ -632,31 +676,31 @@
           <w:sz w:val="20"/>
           <w:szCs w:val="20"/>
         </w:rPr>
-        <w:t xml:space="preserve">Automation workflows (Claude Code, Cursor), MCP and API integrations (Windsor.ai), vibe-coded apps and bots (deployed on fly.io), AI UGC workflow design (avatar, voice, motion, video), tools: Runway, Jitter, Gemini, Seedance, Wan, Seeaudio, ElevenLabs; </w:t>
-      </w:r>
-      <w:r>
-        <w:rPr>
-          <w:rFonts w:ascii="Calibri" w:cs="Calibri" w:eastAsia="Calibri" w:hAnsi="Calibri"/>
-          <w:b/>
-          <w:bCs/>
-          <w:i w:val="false"/>
-          <w:iCs w:val="false"/>
-          <w:sz w:val="20"/>
-          <w:szCs w:val="20"/>
-        </w:rPr>
-        <w:t xml:space="preserve">Research &amp; insight: </w:t>
-      </w:r>
-      <w:r>
-        <w:rPr>
-          <w:rFonts w:ascii="Calibri" w:cs="Calibri" w:eastAsia="Calibri" w:hAnsi="Calibri"/>
-          <w:b w:val="false"/>
-          <w:bCs w:val="false"/>
-          <w:i w:val="false"/>
-          <w:iCs w:val="false"/>
-          <w:sz w:val="20"/>
-          <w:szCs w:val="20"/>
-        </w:rPr>
-        <w:t xml:space="preserve">Survey design and segmentation, customer research programmes, competitor research (Appfollow), funnel and cohort analysis, experimental test design, Power BI, Excel, Microsoft Clarity, R, Python, SQL; </w:t>
+        <w:t xml:space="preserve">Automation workflows (Claude Code, Cursor), MCP and API integrations (Windsor.ai), vibe-coded apps and bots (deployed on fly.io), prompt engineering, evaluation of 6 model providers, AI UGC workflow design, tools: Runway, Jitter, Gemini, ElevenLabs; </w:t>
+      </w:r>
+      <w:r>
+        <w:rPr>
+          <w:rFonts w:ascii="Calibri" w:cs="Calibri" w:eastAsia="Calibri" w:hAnsi="Calibri"/>
+          <w:b/>
+          <w:bCs/>
+          <w:i w:val="false"/>
+          <w:iCs w:val="false"/>
+          <w:sz w:val="20"/>
+          <w:szCs w:val="20"/>
+        </w:rPr>
+        <w:t xml:space="preserve">Customer insight: </w:t>
+      </w:r>
+      <w:r>
+        <w:rPr>
+          <w:rFonts w:ascii="Calibri" w:cs="Calibri" w:eastAsia="Calibri" w:hAnsi="Calibri"/>
+          <w:b w:val="false"/>
+          <w:bCs w:val="false"/>
+          <w:i w:val="false"/>
+          <w:iCs w:val="false"/>
+          <w:sz w:val="20"/>
+          <w:szCs w:val="20"/>
+        </w:rPr>
+        <w:t xml:space="preserve">Survey design and segmentation, customer and competitor research (Appfollow), funnel and cohort analysis, structured test design, Power BI, Excel, Microsoft Clarity, R, Python, SQL; </w:t>
       </w:r>
       <w:r>
         <w:rPr>
@@ -680,55 +724,55 @@
           <w:sz w:val="20"/>
           <w:szCs w:val="20"/>
         </w:rPr>
-        <w:t xml:space="preserve">Market entry planning, positioning and messaging, brand and tone, customer-facing and app-store content, KOL, affiliate and referral partnerships, regulated messaging review with Legal and Compliance; </w:t>
-      </w:r>
-      <w:r>
-        <w:rPr>
-          <w:rFonts w:ascii="Calibri" w:cs="Calibri" w:eastAsia="Calibri" w:hAnsi="Calibri"/>
-          <w:b/>
-          <w:bCs/>
-          <w:i w:val="false"/>
-          <w:iCs w:val="false"/>
-          <w:sz w:val="20"/>
-          <w:szCs w:val="20"/>
-        </w:rPr>
-        <w:t xml:space="preserve">Creative: </w:t>
-      </w:r>
-      <w:r>
-        <w:rPr>
-          <w:rFonts w:ascii="Calibri" w:cs="Calibri" w:eastAsia="Calibri" w:hAnsi="Calibri"/>
-          <w:b w:val="false"/>
-          <w:bCs w:val="false"/>
-          <w:i w:val="false"/>
-          <w:iCs w:val="false"/>
-          <w:sz w:val="20"/>
-          <w:szCs w:val="20"/>
-        </w:rPr>
-        <w:t xml:space="preserve">Creative briefing and direction, AI UGC production, agency and partner management, Figma, Photoshop; </w:t>
-      </w:r>
-      <w:r>
-        <w:rPr>
-          <w:rFonts w:ascii="Calibri" w:cs="Calibri" w:eastAsia="Calibri" w:hAnsi="Calibri"/>
-          <w:b/>
-          <w:bCs/>
-          <w:i w:val="false"/>
-          <w:iCs w:val="false"/>
-          <w:sz w:val="20"/>
-          <w:szCs w:val="20"/>
-        </w:rPr>
-        <w:t xml:space="preserve">Paid media: </w:t>
-      </w:r>
-      <w:r>
-        <w:rPr>
-          <w:rFonts w:ascii="Calibri" w:cs="Calibri" w:eastAsia="Calibri" w:hAnsi="Calibri"/>
-          <w:b w:val="false"/>
-          <w:bCs w:val="false"/>
-          <w:i w:val="false"/>
-          <w:iCs w:val="false"/>
-          <w:sz w:val="20"/>
-          <w:szCs w:val="20"/>
-        </w:rPr>
-        <w:t xml:space="preserve">Apple Search Ads, Google Ads, Meta, TikTok, LinkedIn, ASO and Custom Product Page, international campaign structure, creative testing and budget allocation; </w:t>
+        <w:t xml:space="preserve">Market entry planning, positioning and messaging, brand and tone, CRM and localised customer communications, product page and app-store content, KOL, affiliate and referral partnerships; </w:t>
+      </w:r>
+      <w:r>
+        <w:rPr>
+          <w:rFonts w:ascii="Calibri" w:cs="Calibri" w:eastAsia="Calibri" w:hAnsi="Calibri"/>
+          <w:b/>
+          <w:bCs/>
+          <w:i w:val="false"/>
+          <w:iCs w:val="false"/>
+          <w:sz w:val="20"/>
+          <w:szCs w:val="20"/>
+        </w:rPr>
+        <w:t xml:space="preserve">Cross-functional: </w:t>
+      </w:r>
+      <w:r>
+        <w:rPr>
+          <w:rFonts w:ascii="Calibri" w:cs="Calibri" w:eastAsia="Calibri" w:hAnsi="Calibri"/>
+          <w:b w:val="false"/>
+          <w:bCs w:val="false"/>
+          <w:i w:val="false"/>
+          <w:iCs w:val="false"/>
+          <w:sz w:val="20"/>
+          <w:szCs w:val="20"/>
+        </w:rPr>
+        <w:t xml:space="preserve">Regulated messaging review with Compliance, delivery with Front-End Engineering, Data Engineering and Security, multi-market delivery across UK, US and EU; </w:t>
+      </w:r>
+      <w:r>
+        <w:rPr>
+          <w:rFonts w:ascii="Calibri" w:cs="Calibri" w:eastAsia="Calibri" w:hAnsi="Calibri"/>
+          <w:b/>
+          <w:bCs/>
+          <w:i w:val="false"/>
+          <w:iCs w:val="false"/>
+          <w:sz w:val="20"/>
+          <w:szCs w:val="20"/>
+        </w:rPr>
+        <w:t xml:space="preserve">Marketing workflows: </w:t>
+      </w:r>
+      <w:r>
+        <w:rPr>
+          <w:rFonts w:ascii="Calibri" w:cs="Calibri" w:eastAsia="Calibri" w:hAnsi="Calibri"/>
+          <w:b w:val="false"/>
+          <w:bCs w:val="false"/>
+          <w:i w:val="false"/>
+          <w:iCs w:val="false"/>
+          <w:sz w:val="20"/>
+          <w:szCs w:val="20"/>
+        </w:rPr>
+        <w:t xml:space="preserve">Apple Search Ads, Google Ads, Meta, TikTok, LinkedIn, creative briefing and direction, Figma, Photoshop; </w:t>
       </w:r>
       <w:r>
         <w:rPr>
@@ -752,7 +796,7 @@
           <w:sz w:val="20"/>
           <w:szCs w:val="20"/>
         </w:rPr>
-        <w:t xml:space="preserve">Digital assets, business psychology, languages; </w:t>
+        <w:t xml:space="preserve">Digital assets, business psychology, languages, martial arts, weightlifting; </w:t>
       </w:r>
       <w:r>
         <w:rPr>

</xml_diff>

<commit_message>
Rebuild BVNK CV on Jessie's October base CV
Keeps her bullet wording where it carries over and adds the BVNK-relevant
lines from the record: CRM localisation, regulated messaging, Malaysia
go-to-market, MCP integrations and the Compliance reviews at Malaberg.
Flags four differences between her base CV and the performance note in
OPEN-QUESTIONS.md. Verified at one page.

Co-Authored-By: Claude Opus 5.5 <noreply@anthropic.com>
Claude-Session: https://claude.ai/code/session_01Qg3JRGKeFtCXXeV9rGpzwA
</commit_message>
<xml_diff>
--- a/dist/Jessie-Chan-CV-bvnk-pmm.docx
+++ b/dist/Jessie-Chan-CV-bvnk-pmm.docx
@@ -52,7 +52,7 @@
           <w:sz w:val="20"/>
           <w:szCs w:val="20"/>
         </w:rPr>
-        <w:t xml:space="preserve">Crypto marketer working across retail, wealth and institutional products, focused on customer research, regulated customer communications and AI automation. I have run research across 3 customer segments, written and reviewed customer-facing messaging with Compliance across UK, US and EU markets, and built the reporting and automation workflows the team runs on. I use Claude Code and Cursor daily and build MCP and API integrations. Data-science research background, working in 4 languages.</w:t>
+        <w:t xml:space="preserve">Fintech/crypto marketer with hands-on experience across customer research, regulated customer communications and go-to-market, covering retail, wealth and institutional products in 26 markets. I use AI to solve go-to-market problems, building the automation, reporting, MCP and API integrations and internal bots the team runs on. Experienced in working with Compliance, Product and Engineering in a regulated environment, with a data-science research background.</w:t>
       </w:r>
     </w:p>
     <w:p>
@@ -155,7 +155,7 @@
           <w:sz w:val="20"/>
           <w:szCs w:val="20"/>
         </w:rPr>
-        <w:t xml:space="preserve">Designed and ran a customer survey across 3 customer segments, returning 114 responses at a 14% response rate</w:t>
+        <w:t xml:space="preserve">Built an outreach channel of 80 crypto publishers for high net worth client acquisition that sourced 3 major clients, plus a 100-operator database for institutional business development</w:t>
       </w:r>
     </w:p>
     <w:p>
@@ -177,7 +177,7 @@
           <w:sz w:val="20"/>
           <w:szCs w:val="20"/>
         </w:rPr>
-        <w:t xml:space="preserve">Sourced 3 major Wealth clients through an outreach channel of 80 crypto publishers, and built a 100-operator database for Institutional business development</w:t>
+        <w:t xml:space="preserve">Supported Retail, Wealth and Institutional customer research and prospecting, including a survey across 3 customer segments returning 114 responses</w:t>
       </w:r>
     </w:p>
     <w:p>
@@ -243,7 +243,7 @@
           <w:sz w:val="20"/>
           <w:szCs w:val="20"/>
         </w:rPr>
-        <w:t xml:space="preserve">Partnered with Front-End Engineering to ship refreshed Personal and Earn product pages across jurisdictions</w:t>
+        <w:t xml:space="preserve">Developing go-to-market for the loans product in Malaysia, covering competitor review, brand and tone, and KOL, affiliate and referral partnerships</w:t>
       </w:r>
     </w:p>
     <w:p>
@@ -265,7 +265,7 @@
           <w:sz w:val="20"/>
           <w:szCs w:val="20"/>
         </w:rPr>
-        <w:t xml:space="preserve">Developing go-to-market for the loans product in Malaysia, covering competitor review, brand and tone, and KOL, affiliate and referral partnerships</w:t>
+        <w:t xml:space="preserve">Automated daily paid media channels reporting with Claude Code, cutting 30 min/day of manual work, and partnered with Data Engineering and Security to publish it as an internal dashboard</w:t>
       </w:r>
     </w:p>
     <w:p>
@@ -287,7 +287,7 @@
           <w:sz w:val="20"/>
           <w:szCs w:val="20"/>
         </w:rPr>
-        <w:t xml:space="preserve">Automated daily reporting with Claude Code and Cursor, cutting 30 min/day of manual work, and partnered with Data Engineering and Security to publish it as an internal dashboard</w:t>
+        <w:t xml:space="preserve">Built MCP and API integrations and internal bots to remove repeat manual work across the team</w:t>
       </w:r>
     </w:p>
     <w:p>
@@ -309,7 +309,7 @@
           <w:sz w:val="20"/>
           <w:szCs w:val="20"/>
         </w:rPr>
-        <w:t xml:space="preserve">Built MCP and API integrations and internal bots to remove repeat manual work across the team</w:t>
+        <w:t xml:space="preserve">Developed an AI-powered UGC production workflow, delivering 100+ video assets across TikTok and Google Ads, increasing CTR from 0.4% to 1.15% (+188%), reducing CPI from $25 to $6 (−76%), and cutting production time by 75%</w:t>
       </w:r>
     </w:p>
     <w:p>
@@ -331,7 +331,68 @@
           <w:sz w:val="20"/>
           <w:szCs w:val="20"/>
         </w:rPr>
-        <w:t xml:space="preserve">Developed an AI-powered UGC production workflow, delivering 100+ video assets and cutting production time by 75%</w:t>
+        <w:t xml:space="preserve">Ran 128 structured campaign tests across 26 countries, identifying 5 scalable campaign groups and reallocating budget away from 26 underperforming campaigns</w:t>
+      </w:r>
+    </w:p>
+    <w:p>
+      <w:pPr>
+        <w:tabs>
+          <w:tab w:val="right" w:pos="10466"/>
+        </w:tabs>
+        <w:spacing w:after="10" w:before="100"/>
+      </w:pPr>
+      <w:r>
+        <w:rPr>
+          <w:rFonts w:ascii="Calibri" w:cs="Calibri" w:eastAsia="Calibri" w:hAnsi="Calibri"/>
+          <w:b/>
+          <w:bCs/>
+          <w:i w:val="false"/>
+          <w:iCs w:val="false"/>
+          <w:sz w:val="20"/>
+          <w:szCs w:val="20"/>
+        </w:rPr>
+        <w:t xml:space="preserve">Performance Marketer</w:t>
+      </w:r>
+      <w:r>
+        <w:rPr>
+          <w:rFonts w:ascii="Calibri" w:cs="Calibri" w:eastAsia="Calibri" w:hAnsi="Calibri"/>
+          <w:b w:val="false"/>
+          <w:bCs w:val="false"/>
+          <w:i w:val="false"/>
+          <w:iCs w:val="false"/>
+          <w:sz w:val="20"/>
+          <w:szCs w:val="20"/>
+        </w:rPr>
+        <w:t xml:space="preserve">	</w:t>
+      </w:r>
+      <w:r>
+        <w:rPr>
+          <w:rFonts w:ascii="Calibri" w:cs="Calibri" w:eastAsia="Calibri" w:hAnsi="Calibri"/>
+          <w:b/>
+          <w:bCs/>
+          <w:i w:val="false"/>
+          <w:iCs w:val="false"/>
+          <w:sz w:val="20"/>
+          <w:szCs w:val="20"/>
+        </w:rPr>
+        <w:t xml:space="preserve">Feb 2025 – Apr 2026</w:t>
+      </w:r>
+    </w:p>
+    <w:p>
+      <w:pPr>
+        <w:spacing w:after="60"/>
+      </w:pPr>
+      <w:r>
+        <w:rPr>
+          <w:rFonts w:ascii="Calibri" w:cs="Calibri" w:eastAsia="Calibri" w:hAnsi="Calibri"/>
+          <w:b w:val="false"/>
+          <w:bCs w:val="false"/>
+          <w:i/>
+          <w:iCs/>
+          <w:sz w:val="20"/>
+          <w:szCs w:val="20"/>
+        </w:rPr>
+        <w:t xml:space="preserve">Malaberg, London, United Kingdom</w:t>
       </w:r>
     </w:p>
     <w:p>
@@ -353,68 +414,7 @@
           <w:sz w:val="20"/>
           <w:szCs w:val="20"/>
         </w:rPr>
-        <w:t xml:space="preserve">Ran 128 structured campaign tests across 26 markets, reallocating budget away from 26 underperforming campaigns</w:t>
-      </w:r>
-    </w:p>
-    <w:p>
-      <w:pPr>
-        <w:tabs>
-          <w:tab w:val="right" w:pos="10466"/>
-        </w:tabs>
-        <w:spacing w:after="10" w:before="100"/>
-      </w:pPr>
-      <w:r>
-        <w:rPr>
-          <w:rFonts w:ascii="Calibri" w:cs="Calibri" w:eastAsia="Calibri" w:hAnsi="Calibri"/>
-          <w:b/>
-          <w:bCs/>
-          <w:i w:val="false"/>
-          <w:iCs w:val="false"/>
-          <w:sz w:val="20"/>
-          <w:szCs w:val="20"/>
-        </w:rPr>
-        <w:t xml:space="preserve">Performance Marketer</w:t>
-      </w:r>
-      <w:r>
-        <w:rPr>
-          <w:rFonts w:ascii="Calibri" w:cs="Calibri" w:eastAsia="Calibri" w:hAnsi="Calibri"/>
-          <w:b w:val="false"/>
-          <w:bCs w:val="false"/>
-          <w:i w:val="false"/>
-          <w:iCs w:val="false"/>
-          <w:sz w:val="20"/>
-          <w:szCs w:val="20"/>
-        </w:rPr>
-        <w:t xml:space="preserve">	</w:t>
-      </w:r>
-      <w:r>
-        <w:rPr>
-          <w:rFonts w:ascii="Calibri" w:cs="Calibri" w:eastAsia="Calibri" w:hAnsi="Calibri"/>
-          <w:b/>
-          <w:bCs/>
-          <w:i w:val="false"/>
-          <w:iCs w:val="false"/>
-          <w:sz w:val="20"/>
-          <w:szCs w:val="20"/>
-        </w:rPr>
-        <w:t xml:space="preserve">Feb 2025 – Apr 2026</w:t>
-      </w:r>
-    </w:p>
-    <w:p>
-      <w:pPr>
-        <w:spacing w:after="60"/>
-      </w:pPr>
-      <w:r>
-        <w:rPr>
-          <w:rFonts w:ascii="Calibri" w:cs="Calibri" w:eastAsia="Calibri" w:hAnsi="Calibri"/>
-          <w:b w:val="false"/>
-          <w:bCs w:val="false"/>
-          <w:i/>
-          <w:iCs/>
-          <w:sz w:val="20"/>
-          <w:szCs w:val="20"/>
-        </w:rPr>
-        <w:t xml:space="preserve">Malaberg, London, United Kingdom</w:t>
+        <w:t xml:space="preserve">Led weekly content reviews with Compliance to clear regulated consumer-finance messaging across all channels</w:t>
       </w:r>
     </w:p>
     <w:p>
@@ -436,7 +436,7 @@
           <w:sz w:val="20"/>
           <w:szCs w:val="20"/>
         </w:rPr>
-        <w:t xml:space="preserve">Led weekly content reviews with Compliance to clear regulated consumer-finance messaging across all channels</w:t>
+        <w:t xml:space="preserve">Built a company-wide automated reporting pipeline on lead conversion, cutting daily report preparation from 30 min to almost immediate output</w:t>
       </w:r>
     </w:p>
     <w:p>
@@ -458,7 +458,7 @@
           <w:sz w:val="20"/>
           <w:szCs w:val="20"/>
         </w:rPr>
-        <w:t xml:space="preserve">Built a company-wide automated reporting pipeline on lead conversion, cutting daily report preparation from 30+ min to almost immediate output</w:t>
+        <w:t xml:space="preserve">Increased daily conversions from 10 to 50+ (5x) by rebuilding landing and promotional pages in Figma and Photoshop, informed by funnel analysis in Power BI, Excel and Microsoft Clarity, increased funnel progression by 5%</w:t>
       </w:r>
     </w:p>
     <w:p>
@@ -480,29 +480,7 @@
           <w:sz w:val="20"/>
           <w:szCs w:val="20"/>
         </w:rPr>
-        <w:t xml:space="preserve">Increased daily conversions from 10 to 50+ (5x) by rebuilding landing and promotional pages in Figma and Photoshop, informed by funnel analysis in Power BI, Excel and Microsoft Clarity</w:t>
-      </w:r>
-    </w:p>
-    <w:p>
-      <w:pPr>
-        <w:pStyle w:val="ListParagraph"/>
-        <w:numPr>
-          <w:ilvl w:val="0"/>
-          <w:numId w:val="2"/>
-        </w:numPr>
-        <w:spacing w:after="50"/>
-      </w:pPr>
-      <w:r>
-        <w:rPr>
-          <w:rFonts w:ascii="Calibri" w:cs="Calibri" w:eastAsia="Calibri" w:hAnsi="Calibri"/>
-          <w:b w:val="false"/>
-          <w:bCs w:val="false"/>
-          <w:i w:val="false"/>
-          <w:iCs w:val="false"/>
-          <w:sz w:val="20"/>
-          <w:szCs w:val="20"/>
-        </w:rPr>
-        <w:t xml:space="preserve">Managed £50k+ monthly paid budget managing ads and conversion funnels, sustaining 120% ROAS</w:t>
+        <w:t xml:space="preserve">Managed £50k+ monthly paid budget with full accountability for efficiency, sustaining 120% ROAS</w:t>
       </w:r>
     </w:p>
     <w:p>
@@ -676,31 +654,31 @@
           <w:sz w:val="20"/>
           <w:szCs w:val="20"/>
         </w:rPr>
-        <w:t xml:space="preserve">Automation workflows (Claude Code, Cursor), MCP and API integrations (Windsor.ai), vibe-coded apps and bots (deployed on fly.io), prompt engineering, evaluation of 6 model providers, AI UGC workflow design, tools: Runway, Jitter, Gemini, ElevenLabs; </w:t>
-      </w:r>
-      <w:r>
-        <w:rPr>
-          <w:rFonts w:ascii="Calibri" w:cs="Calibri" w:eastAsia="Calibri" w:hAnsi="Calibri"/>
-          <w:b/>
-          <w:bCs/>
-          <w:i w:val="false"/>
-          <w:iCs w:val="false"/>
-          <w:sz w:val="20"/>
-          <w:szCs w:val="20"/>
-        </w:rPr>
-        <w:t xml:space="preserve">Customer insight: </w:t>
-      </w:r>
-      <w:r>
-        <w:rPr>
-          <w:rFonts w:ascii="Calibri" w:cs="Calibri" w:eastAsia="Calibri" w:hAnsi="Calibri"/>
-          <w:b w:val="false"/>
-          <w:bCs w:val="false"/>
-          <w:i w:val="false"/>
-          <w:iCs w:val="false"/>
-          <w:sz w:val="20"/>
-          <w:szCs w:val="20"/>
-        </w:rPr>
-        <w:t xml:space="preserve">Survey design and segmentation, customer and competitor research (Appfollow), funnel and cohort analysis, structured test design, Power BI, Excel, Microsoft Clarity, R, Python, SQL; </w:t>
+        <w:t xml:space="preserve">Automation workflows (Claude Code, Cursor), MCP and API integrations (Windsor.ai), vibe-coded apps and bots (deployed on fly.io), AI UGC workflow design (avatar, voice, motion, video), tools: Runway, Jitter, Gemini, Seedance, Wan, Seeaudio, ElevenLabs; </w:t>
+      </w:r>
+      <w:r>
+        <w:rPr>
+          <w:rFonts w:ascii="Calibri" w:cs="Calibri" w:eastAsia="Calibri" w:hAnsi="Calibri"/>
+          <w:b/>
+          <w:bCs/>
+          <w:i w:val="false"/>
+          <w:iCs w:val="false"/>
+          <w:sz w:val="20"/>
+          <w:szCs w:val="20"/>
+        </w:rPr>
+        <w:t xml:space="preserve">Research &amp; insight: </w:t>
+      </w:r>
+      <w:r>
+        <w:rPr>
+          <w:rFonts w:ascii="Calibri" w:cs="Calibri" w:eastAsia="Calibri" w:hAnsi="Calibri"/>
+          <w:b w:val="false"/>
+          <w:bCs w:val="false"/>
+          <w:i w:val="false"/>
+          <w:iCs w:val="false"/>
+          <w:sz w:val="20"/>
+          <w:szCs w:val="20"/>
+        </w:rPr>
+        <w:t xml:space="preserve">Survey design and segmentation, customer research and prospecting, competitor research (Appfollow), funnel and cohort analysis, experimental test design, Power BI, Excel, Microsoft Clarity, R, Python, SQL; </w:t>
       </w:r>
       <w:r>
         <w:rPr>
@@ -724,55 +702,31 @@
           <w:sz w:val="20"/>
           <w:szCs w:val="20"/>
         </w:rPr>
-        <w:t xml:space="preserve">Market entry planning, positioning and messaging, brand and tone, CRM and localised customer communications, product page and app-store content, KOL, affiliate and referral partnerships; </w:t>
-      </w:r>
-      <w:r>
-        <w:rPr>
-          <w:rFonts w:ascii="Calibri" w:cs="Calibri" w:eastAsia="Calibri" w:hAnsi="Calibri"/>
-          <w:b/>
-          <w:bCs/>
-          <w:i w:val="false"/>
-          <w:iCs w:val="false"/>
-          <w:sz w:val="20"/>
-          <w:szCs w:val="20"/>
-        </w:rPr>
-        <w:t xml:space="preserve">Cross-functional: </w:t>
-      </w:r>
-      <w:r>
-        <w:rPr>
-          <w:rFonts w:ascii="Calibri" w:cs="Calibri" w:eastAsia="Calibri" w:hAnsi="Calibri"/>
-          <w:b w:val="false"/>
-          <w:bCs w:val="false"/>
-          <w:i w:val="false"/>
-          <w:iCs w:val="false"/>
-          <w:sz w:val="20"/>
-          <w:szCs w:val="20"/>
-        </w:rPr>
-        <w:t xml:space="preserve">Regulated messaging review with Compliance, delivery with Front-End Engineering, Data Engineering and Security, multi-market delivery across UK, US and EU; </w:t>
-      </w:r>
-      <w:r>
-        <w:rPr>
-          <w:rFonts w:ascii="Calibri" w:cs="Calibri" w:eastAsia="Calibri" w:hAnsi="Calibri"/>
-          <w:b/>
-          <w:bCs/>
-          <w:i w:val="false"/>
-          <w:iCs w:val="false"/>
-          <w:sz w:val="20"/>
-          <w:szCs w:val="20"/>
-        </w:rPr>
-        <w:t xml:space="preserve">Marketing workflows: </w:t>
-      </w:r>
-      <w:r>
-        <w:rPr>
-          <w:rFonts w:ascii="Calibri" w:cs="Calibri" w:eastAsia="Calibri" w:hAnsi="Calibri"/>
-          <w:b w:val="false"/>
-          <w:bCs w:val="false"/>
-          <w:i w:val="false"/>
-          <w:iCs w:val="false"/>
-          <w:sz w:val="20"/>
-          <w:szCs w:val="20"/>
-        </w:rPr>
-        <w:t xml:space="preserve">Apple Search Ads, Google Ads, Meta, TikTok, LinkedIn, creative briefing and direction, Figma, Photoshop; </w:t>
+        <w:t xml:space="preserve">Market entry planning, positioning and messaging, brand and tone, CRM and localised customer communications, app-store content, KOL, affiliate and referral partnerships, regulated messaging review with Compliance; </w:t>
+      </w:r>
+      <w:r>
+        <w:rPr>
+          <w:rFonts w:ascii="Calibri" w:cs="Calibri" w:eastAsia="Calibri" w:hAnsi="Calibri"/>
+          <w:b/>
+          <w:bCs/>
+          <w:i w:val="false"/>
+          <w:iCs w:val="false"/>
+          <w:sz w:val="20"/>
+          <w:szCs w:val="20"/>
+        </w:rPr>
+        <w:t xml:space="preserve">Creative &amp; paid media: </w:t>
+      </w:r>
+      <w:r>
+        <w:rPr>
+          <w:rFonts w:ascii="Calibri" w:cs="Calibri" w:eastAsia="Calibri" w:hAnsi="Calibri"/>
+          <w:b w:val="false"/>
+          <w:bCs w:val="false"/>
+          <w:i w:val="false"/>
+          <w:iCs w:val="false"/>
+          <w:sz w:val="20"/>
+          <w:szCs w:val="20"/>
+        </w:rPr>
+        <w:t xml:space="preserve">Creative briefing and direction, agency and partner management, Figma, Photoshop, Apple Search Ads, Google Ads, Meta, TikTok, LinkedIn; </w:t>
       </w:r>
       <w:r>
         <w:rPr>

</xml_diff>

<commit_message>
Add manager's business case to the record, CVs and a BVNK cover letter
Records the hiring case and stakeholder feedback as section 8 of the
performance note: UK FinProm approval rollout, Adclear, confirmed survey
ownership, the US campaign at ~2x, and the visa position.

BVNK and Kraken CVs now carry the FinProm rollout and Adclear. Adds a
BVNK cover letter in her voice. Resolves the survey attribution question
and adds visa sponsorship to OPEN-QUESTIONS. All variants verified at one
page.

Co-Authored-By: Claude Opus 5.5 <noreply@anthropic.com>
Claude-Session: https://claude.ai/code/session_01Qg3JRGKeFtCXXeV9rGpzwA
</commit_message>
<xml_diff>
--- a/dist/Jessie-Chan-CV-bvnk-pmm.docx
+++ b/dist/Jessie-Chan-CV-bvnk-pmm.docx
@@ -52,7 +52,7 @@
           <w:sz w:val="20"/>
           <w:szCs w:val="20"/>
         </w:rPr>
-        <w:t xml:space="preserve">Fintech/crypto marketer with hands-on experience across customer research, regulated customer communications and go-to-market, covering retail, wealth and institutional products in 26 markets. I use AI to solve go-to-market problems, building the automation, reporting, MCP and API integrations and internal bots the team runs on. Experienced in working with Compliance, Product and Engineering in a regulated environment, with a data-science research background.</w:t>
+        <w:t xml:space="preserve">Fintech/crypto marketer with hands-on experience across customer research, regulated customer communications and go-to-market, covering retail, wealth and institutional products in 26 markets. I use AI to solve go-to-market problems, building the automation, reporting, MCP and API integrations and internal bots the team runs on. Experienced in working with Compliance, Legal, Product and Engineering in a regulated environment, with a data-science research background.</w:t>
       </w:r>
     </w:p>
     <w:p>
@@ -177,7 +177,7 @@
           <w:sz w:val="20"/>
           <w:szCs w:val="20"/>
         </w:rPr>
-        <w:t xml:space="preserve">Supported Retail, Wealth and Institutional customer research and prospecting, including a survey across 3 customer segments returning 114 responses</w:t>
+        <w:t xml:space="preserve">Designed and launched a customer survey across 3 customer segments, returning 114 responses at a 14% response rate, to support Retail, Wealth and Institutional research and prospecting</w:t>
       </w:r>
     </w:p>
     <w:p>
@@ -221,7 +221,7 @@
           <w:sz w:val="20"/>
           <w:szCs w:val="20"/>
         </w:rPr>
-        <w:t xml:space="preserve">Developed and reviewed regulated customer-facing messaging across all retail products and 20 app-store storefronts in UK, US and EU markets</w:t>
+        <w:t xml:space="preserve">Played a key role in rolling out the UK FinProm approval process with Compliance, and reviewed regulated customer-facing messaging across all retail products and 20 app-store storefronts in UK, US and EU markets</w:t>
       </w:r>
     </w:p>
     <w:p>
@@ -702,7 +702,7 @@
           <w:sz w:val="20"/>
           <w:szCs w:val="20"/>
         </w:rPr>
-        <w:t xml:space="preserve">Market entry planning, positioning and messaging, brand and tone, CRM and localised customer communications, app-store content, KOL, affiliate and referral partnerships, regulated messaging review with Compliance; </w:t>
+        <w:t xml:space="preserve">Market entry planning, positioning and messaging, brand and tone, CRM and localised customer communications, app-store content, KOL, affiliate and referral partnerships, financial promotions approval (UK FinProm, Adclear); </w:t>
       </w:r>
       <w:r>
         <w:rPr>

</xml_diff>

<commit_message>
Lead the BVNK CV with its strongest evidence, drop the survey
Bullets now run by strength: FinProm rollout, the 3 Wealth clients, CRM
localisation, AI UGC results, then automation. The survey is activity
with no outcome and comes off the CV. The cover letter leads with the
FinProm rollout too. Records the ordering rule in writing-preferences.

Co-Authored-By: Claude Opus 5.5 <noreply@anthropic.com>
Claude-Session: https://claude.ai/code/session_01Qg3JRGKeFtCXXeV9rGpzwA
</commit_message>
<xml_diff>
--- a/dist/Jessie-Chan-CV-bvnk-pmm.docx
+++ b/dist/Jessie-Chan-CV-bvnk-pmm.docx
@@ -155,7 +155,7 @@
           <w:sz w:val="20"/>
           <w:szCs w:val="20"/>
         </w:rPr>
-        <w:t xml:space="preserve">Built an outreach channel of 80 crypto publishers for high net worth client acquisition that sourced 3 major clients, plus a 100-operator database for institutional business development</w:t>
+        <w:t xml:space="preserve">Played a key role in rolling out the UK FinProm approval process with Compliance, and reviewed regulated customer-facing messaging across all retail products and 20 app-store storefronts in UK, US and EU markets</w:t>
       </w:r>
     </w:p>
     <w:p>
@@ -177,7 +177,7 @@
           <w:sz w:val="20"/>
           <w:szCs w:val="20"/>
         </w:rPr>
-        <w:t xml:space="preserve">Designed and launched a customer survey across 3 customer segments, returning 114 responses at a 14% response rate, to support Retail, Wealth and Institutional research and prospecting</w:t>
+        <w:t xml:space="preserve">Built an outreach channel of 80 crypto publishers for high net worth client acquisition that sourced 3 major clients, plus a 100-operator database for institutional business development</w:t>
       </w:r>
     </w:p>
     <w:p>
@@ -221,7 +221,7 @@
           <w:sz w:val="20"/>
           <w:szCs w:val="20"/>
         </w:rPr>
-        <w:t xml:space="preserve">Played a key role in rolling out the UK FinProm approval process with Compliance, and reviewed regulated customer-facing messaging across all retail products and 20 app-store storefronts in UK, US and EU markets</w:t>
+        <w:t xml:space="preserve">Developed an AI-powered UGC production workflow, delivering 100+ video assets across TikTok and Google Ads, increasing CTR from 0.4% to 1.15% (+188%), reducing CPI from $25 to $6 (−76%), and cutting production time by 75%</w:t>
       </w:r>
     </w:p>
     <w:p>
@@ -243,7 +243,7 @@
           <w:sz w:val="20"/>
           <w:szCs w:val="20"/>
         </w:rPr>
-        <w:t xml:space="preserve">Developing go-to-market for the loans product in Malaysia, covering competitor review, brand and tone, and KOL, affiliate and referral partnerships</w:t>
+        <w:t xml:space="preserve">Automated daily paid media channels reporting with Claude Code, cutting 30 min/day of manual work, and partnered with Data Engineering and Security to publish it as an internal dashboard</w:t>
       </w:r>
     </w:p>
     <w:p>
@@ -265,7 +265,7 @@
           <w:sz w:val="20"/>
           <w:szCs w:val="20"/>
         </w:rPr>
-        <w:t xml:space="preserve">Automated daily paid media channels reporting with Claude Code, cutting 30 min/day of manual work, and partnered with Data Engineering and Security to publish it as an internal dashboard</w:t>
+        <w:t xml:space="preserve">Built MCP and API integrations and internal bots to remove repeat manual work across the team</w:t>
       </w:r>
     </w:p>
     <w:p>
@@ -287,29 +287,7 @@
           <w:sz w:val="20"/>
           <w:szCs w:val="20"/>
         </w:rPr>
-        <w:t xml:space="preserve">Built MCP and API integrations and internal bots to remove repeat manual work across the team</w:t>
-      </w:r>
-    </w:p>
-    <w:p>
-      <w:pPr>
-        <w:pStyle w:val="ListParagraph"/>
-        <w:numPr>
-          <w:ilvl w:val="0"/>
-          <w:numId w:val="2"/>
-        </w:numPr>
-        <w:spacing w:after="50"/>
-      </w:pPr>
-      <w:r>
-        <w:rPr>
-          <w:rFonts w:ascii="Calibri" w:cs="Calibri" w:eastAsia="Calibri" w:hAnsi="Calibri"/>
-          <w:b w:val="false"/>
-          <w:bCs w:val="false"/>
-          <w:i w:val="false"/>
-          <w:iCs w:val="false"/>
-          <w:sz w:val="20"/>
-          <w:szCs w:val="20"/>
-        </w:rPr>
-        <w:t xml:space="preserve">Developed an AI-powered UGC production workflow, delivering 100+ video assets across TikTok and Google Ads, increasing CTR from 0.4% to 1.15% (+188%), reducing CPI from $25 to $6 (−76%), and cutting production time by 75%</w:t>
+        <w:t xml:space="preserve">Developing go-to-market for the loans product in Malaysia, covering competitor review, brand and tone, and KOL, affiliate and referral partnerships</w:t>
       </w:r>
     </w:p>
     <w:p>

</xml_diff>

<commit_message>
Lead BVNK CV with the Malaysia loans result, in bold
Adds bold-bullet support to the renderer. Records the 4 converted loans
clients. Trims the outreach bullet to its result, folds the MCP bullet
into a concrete reporting bullet, and reframes the test bullet around
product messaging. FinProm bullet carries a placeholder for its result.

Co-Authored-By: Claude Opus 5.5 <noreply@anthropic.com>
Claude-Session: https://claude.ai/code/session_01Qg3JRGKeFtCXXeV9rGpzwA
</commit_message>
<xml_diff>
--- a/dist/Jessie-Chan-CV-bvnk-pmm.docx
+++ b/dist/Jessie-Chan-CV-bvnk-pmm.docx
@@ -148,14 +148,14 @@
       <w:r>
         <w:rPr>
           <w:rFonts w:ascii="Calibri" w:cs="Calibri" w:eastAsia="Calibri" w:hAnsi="Calibri"/>
-          <w:b w:val="false"/>
-          <w:bCs w:val="false"/>
-          <w:i w:val="false"/>
-          <w:iCs w:val="false"/>
-          <w:sz w:val="20"/>
-          <w:szCs w:val="20"/>
-        </w:rPr>
-        <w:t xml:space="preserve">Played a key role in rolling out the UK FinProm approval process with Compliance, and reviewed regulated customer-facing messaging across all retail products and 20 app-store storefronts in UK, US and EU markets</w:t>
+          <w:b/>
+          <w:bCs/>
+          <w:i w:val="false"/>
+          <w:iCs w:val="false"/>
+          <w:sz w:val="20"/>
+          <w:szCs w:val="20"/>
+        </w:rPr>
+        <w:t xml:space="preserve">Converted 4 clients onto the loans product in Malaysia, developing its go-to-market across competitor review, brand and tone, and KOL, affiliate and referral partnerships</w:t>
       </w:r>
     </w:p>
     <w:p>
@@ -177,7 +177,7 @@
           <w:sz w:val="20"/>
           <w:szCs w:val="20"/>
         </w:rPr>
-        <w:t xml:space="preserve">Built an outreach channel of 80 crypto publishers for high net worth client acquisition that sourced 3 major clients, plus a 100-operator database for institutional business development</w:t>
+        <w:t xml:space="preserve">Built an outreach channel of 80 crypto publishers for high net worth client acquisition that sourced 3 major clients</w:t>
       </w:r>
     </w:p>
     <w:p>
@@ -199,7 +199,7 @@
           <w:sz w:val="20"/>
           <w:szCs w:val="20"/>
         </w:rPr>
-        <w:t xml:space="preserve">Implemented API tools to translate CRM communications into local languages, increasing email open rate by 10%</w:t>
+        <w:t xml:space="preserve">Rolled out the UK FinProm approval process with Compliance across all retail products and 20 app-store storefronts, [ADD: result — e.g. promotions approved, or approval time cut from X to Y]</w:t>
       </w:r>
     </w:p>
     <w:p>
@@ -221,7 +221,7 @@
           <w:sz w:val="20"/>
           <w:szCs w:val="20"/>
         </w:rPr>
-        <w:t xml:space="preserve">Developed an AI-powered UGC production workflow, delivering 100+ video assets across TikTok and Google Ads, increasing CTR from 0.4% to 1.15% (+188%), reducing CPI from $25 to $6 (−76%), and cutting production time by 75%</w:t>
+        <w:t xml:space="preserve">Implemented API tools to translate CRM communications into local languages, increasing email open rate by 10%</w:t>
       </w:r>
     </w:p>
     <w:p>
@@ -243,7 +243,7 @@
           <w:sz w:val="20"/>
           <w:szCs w:val="20"/>
         </w:rPr>
-        <w:t xml:space="preserve">Automated daily paid media channels reporting with Claude Code, cutting 30 min/day of manual work, and partnered with Data Engineering and Security to publish it as an internal dashboard</w:t>
+        <w:t xml:space="preserve">Developed an AI-powered UGC production workflow, delivering 100+ video assets across TikTok and Google Ads, increasing CTR from 0.4% to 1.15% (+188%), reducing CPI from $25 to $6 (−76%), and cutting production time by 75%</w:t>
       </w:r>
     </w:p>
     <w:p>
@@ -265,7 +265,7 @@
           <w:sz w:val="20"/>
           <w:szCs w:val="20"/>
         </w:rPr>
-        <w:t xml:space="preserve">Built MCP and API integrations and internal bots to remove repeat manual work across the team</w:t>
+        <w:t xml:space="preserve">Automated daily paid media reporting with Claude Code, saving the team ~10 hours a month, and partnered with Data Engineering and Security to launch it as a company-wide Streamlit dashboard</w:t>
       </w:r>
     </w:p>
     <w:p>
@@ -287,29 +287,7 @@
           <w:sz w:val="20"/>
           <w:szCs w:val="20"/>
         </w:rPr>
-        <w:t xml:space="preserve">Developing go-to-market for the loans product in Malaysia, covering competitor review, brand and tone, and KOL, affiliate and referral partnerships</w:t>
-      </w:r>
-    </w:p>
-    <w:p>
-      <w:pPr>
-        <w:pStyle w:val="ListParagraph"/>
-        <w:numPr>
-          <w:ilvl w:val="0"/>
-          <w:numId w:val="2"/>
-        </w:numPr>
-        <w:spacing w:after="50"/>
-      </w:pPr>
-      <w:r>
-        <w:rPr>
-          <w:rFonts w:ascii="Calibri" w:cs="Calibri" w:eastAsia="Calibri" w:hAnsi="Calibri"/>
-          <w:b w:val="false"/>
-          <w:bCs w:val="false"/>
-          <w:i w:val="false"/>
-          <w:iCs w:val="false"/>
-          <w:sz w:val="20"/>
-          <w:szCs w:val="20"/>
-        </w:rPr>
-        <w:t xml:space="preserve">Ran 128 structured campaign tests across 26 countries, identifying 5 scalable campaign groups and reallocating budget away from 26 underperforming campaigns</w:t>
+        <w:t xml:space="preserve">Tested product messaging across 26 countries through 128 structured tests and 20+ Custom Product Pages, scaling 5 winning campaign groups and cutting UK cost per install by 21.5% while installs rose 30.2%</w:t>
       </w:r>
     </w:p>
     <w:p>

</xml_diff>

<commit_message>
Move the BVNK product page bullet to the end of the role
It has no result yet, so the bullets with outcomes sit above it.

Co-Authored-By: Claude Opus 5.5 <noreply@anthropic.com>
Claude-Session: https://claude.ai/code/session_01Qg3JRGKeFtCXXeV9rGpzwA
</commit_message>
<xml_diff>
--- a/dist/Jessie-Chan-CV-bvnk-pmm.docx
+++ b/dist/Jessie-Chan-CV-bvnk-pmm.docx
@@ -199,7 +199,7 @@
           <w:sz w:val="20"/>
           <w:szCs w:val="20"/>
         </w:rPr>
-        <w:t xml:space="preserve">Launched refreshed Personal and Earn product pages with Front-End Engineering and refreshed app-store content across 20 storefronts in UK, US and EU markets, clearing all regulated messaging with Compliance</w:t>
+        <w:t xml:space="preserve">Implemented API tools to translate CRM communications into local languages, increasing email open rate by 10%</w:t>
       </w:r>
     </w:p>
     <w:p>
@@ -221,7 +221,7 @@
           <w:sz w:val="20"/>
           <w:szCs w:val="20"/>
         </w:rPr>
-        <w:t xml:space="preserve">Implemented API tools to translate CRM communications into local languages, increasing email open rate by 10%</w:t>
+        <w:t xml:space="preserve">Developed an AI-powered UGC production workflow, delivering 100+ video assets across TikTok and Google Ads, increasing CTR from 0.4% to 1.15% (+188%), reducing CPI from $25 to $6 (−76%), and cutting production time by 75%</w:t>
       </w:r>
     </w:p>
     <w:p>
@@ -243,7 +243,7 @@
           <w:sz w:val="20"/>
           <w:szCs w:val="20"/>
         </w:rPr>
-        <w:t xml:space="preserve">Developed an AI-powered UGC production workflow, delivering 100+ video assets across TikTok and Google Ads, increasing CTR from 0.4% to 1.15% (+188%), reducing CPI from $25 to $6 (−76%), and cutting production time by 75%</w:t>
+        <w:t xml:space="preserve">Automated daily paid media reporting with Claude Code, saving the team ~10 hours a month, and partnered with Data Engineering and Security to launch it as a company-wide Streamlit dashboard</w:t>
       </w:r>
     </w:p>
     <w:p>
@@ -265,7 +265,7 @@
           <w:sz w:val="20"/>
           <w:szCs w:val="20"/>
         </w:rPr>
-        <w:t xml:space="preserve">Automated daily paid media reporting with Claude Code, saving the team ~10 hours a month, and partnered with Data Engineering and Security to launch it as a company-wide Streamlit dashboard</w:t>
+        <w:t xml:space="preserve">Tested product messaging across 26 countries through 128 structured tests and 20+ Custom Product Pages, scaling 5 winning campaign groups and cutting UK cost per install by 21.5% while installs rose 30.2%</w:t>
       </w:r>
     </w:p>
     <w:p>
@@ -287,7 +287,7 @@
           <w:sz w:val="20"/>
           <w:szCs w:val="20"/>
         </w:rPr>
-        <w:t xml:space="preserve">Tested product messaging across 26 countries through 128 structured tests and 20+ Custom Product Pages, scaling 5 winning campaign groups and cutting UK cost per install by 21.5% while installs rose 30.2%</w:t>
+        <w:t xml:space="preserve">Launched refreshed Personal and Earn product pages with Front-End Engineering and refreshed app-store content across 20 storefronts in UK, US and EU markets, clearing all regulated messaging with Compliance</w:t>
       </w:r>
     </w:p>
     <w:p>

</xml_diff>

<commit_message>
Move Custom Product Page figures into the BVNK product page bullet
Co-Authored-By: Claude Opus 5.5 <noreply@anthropic.com>
Claude-Session: https://claude.ai/code/session_01Qg3JRGKeFtCXXeV9rGpzwA
</commit_message>
<xml_diff>
--- a/dist/Jessie-Chan-CV-bvnk-pmm.docx
+++ b/dist/Jessie-Chan-CV-bvnk-pmm.docx
@@ -265,7 +265,7 @@
           <w:sz w:val="20"/>
           <w:szCs w:val="20"/>
         </w:rPr>
-        <w:t xml:space="preserve">Tested product messaging across 26 countries through 128 structured tests and 20+ Custom Product Pages, scaling 5 winning campaign groups and cutting UK cost per install by 21.5% while installs rose 30.2%</w:t>
+        <w:t xml:space="preserve">Tested product messaging across 26 countries through 128 structured tests, scaling 5 winning campaign groups and cutting UK cost per install by 21.5% while installs rose 30.2%</w:t>
       </w:r>
     </w:p>
     <w:p>
@@ -287,7 +287,7 @@
           <w:sz w:val="20"/>
           <w:szCs w:val="20"/>
         </w:rPr>
-        <w:t xml:space="preserve">Launched refreshed Personal and Earn product pages with Front-End Engineering and refreshed app-store content across 20 storefronts in UK, US and EU markets, clearing all regulated messaging with Compliance</w:t>
+        <w:t xml:space="preserve">Launched refreshed Personal and Earn product pages with Front-End Engineering and refreshed app-store content across 20 storefronts, building 20+ Custom Product Pages across 12 markets and 600+ keywords, with all regulated messaging cleared by Compliance</w:t>
       </w:r>
     </w:p>
     <w:p>

</xml_diff>

<commit_message>
Rewrite BVNK CV in a more confident register
Results first, stronger verbs, no hedging. Figures unchanged.

Co-Authored-By: Claude Opus 5.5 <noreply@anthropic.com>
Claude-Session: https://claude.ai/code/session_01Qg3JRGKeFtCXXeV9rGpzwA
</commit_message>
<xml_diff>
--- a/dist/Jessie-Chan-CV-bvnk-pmm.docx
+++ b/dist/Jessie-Chan-CV-bvnk-pmm.docx
@@ -52,7 +52,7 @@
           <w:sz w:val="20"/>
           <w:szCs w:val="20"/>
         </w:rPr>
-        <w:t xml:space="preserve">Fintech/crypto marketer with hands-on experience across customer research, regulated customer communications and go-to-market, covering retail, wealth and institutional products in 26 markets. I use AI to solve go-to-market problems, building the automation, reporting, MCP and API integrations and internal bots the team runs on. Experienced in working with Compliance, Legal, Product and Engineering in a regulated environment, with a data-science research background.</w:t>
+        <w:t xml:space="preserve">Fintech/crypto marketer owning regulated customer communications, client acquisition and go-to-market across retail, wealth and institutional products in 26 markets. I use AI to solve go-to-market problems, and build the automation, reporting, MCP and API integrations and internal bots the team runs on. I work directly with Compliance, Legal, Product and Engineering in a regulated environment, and bring a data-science research background.</w:t>
       </w:r>
     </w:p>
     <w:p>
@@ -155,7 +155,7 @@
           <w:sz w:val="20"/>
           <w:szCs w:val="20"/>
         </w:rPr>
-        <w:t xml:space="preserve">Converted 4 clients onto the loans product in Malaysia, developing its go-to-market across competitor review, brand and tone, and KOL, affiliate and referral partnerships</w:t>
+        <w:t xml:space="preserve">Converted 4 clients onto the loans product in Malaysia, shaping its go-to-market across competitor review, brand and tone, and KOL, affiliate and referral partnerships</w:t>
       </w:r>
     </w:p>
     <w:p>
@@ -177,7 +177,7 @@
           <w:sz w:val="20"/>
           <w:szCs w:val="20"/>
         </w:rPr>
-        <w:t xml:space="preserve">Built an outreach channel of 80 crypto publishers for high net worth client acquisition that sourced 3 major clients</w:t>
+        <w:t xml:space="preserve">Sourced 3 major high net worth clients by building an outreach channel of 80 crypto publishers</w:t>
       </w:r>
     </w:p>
     <w:p>
@@ -199,7 +199,7 @@
           <w:sz w:val="20"/>
           <w:szCs w:val="20"/>
         </w:rPr>
-        <w:t xml:space="preserve">Implemented API tools to translate CRM communications into local languages, increasing email open rate by 10%</w:t>
+        <w:t xml:space="preserve">Increased email open rate by 10% by implementing API tools that translate CRM communications into local languages</w:t>
       </w:r>
     </w:p>
     <w:p>
@@ -221,7 +221,7 @@
           <w:sz w:val="20"/>
           <w:szCs w:val="20"/>
         </w:rPr>
-        <w:t xml:space="preserve">Developed an AI-powered UGC production workflow, delivering 100+ video assets across TikTok and Google Ads, increasing CTR from 0.4% to 1.15% (+188%), reducing CPI from $25 to $6 (−76%), and cutting production time by 75%</w:t>
+        <w:t xml:space="preserve">Built the company's first in-house AI UGC production workflow, delivering 100+ video assets across TikTok and Google Ads, lifting CTR from 0.4% to 1.15% (+188%), cutting CPI from $25 to $6 (−76%) and production time by 75%</w:t>
       </w:r>
     </w:p>
     <w:p>
@@ -243,7 +243,7 @@
           <w:sz w:val="20"/>
           <w:szCs w:val="20"/>
         </w:rPr>
-        <w:t xml:space="preserve">Automated daily paid media reporting with Claude Code, saving the team ~10 hours a month, and partnered with Data Engineering and Security to launch it as a company-wide Streamlit dashboard</w:t>
+        <w:t xml:space="preserve">Automated daily paid media reporting with Claude Code and led its launch as a company-wide Streamlit dashboard with Data Engineering and Security, saving the team ~10 hours a month</w:t>
       </w:r>
     </w:p>
     <w:p>
@@ -265,7 +265,7 @@
           <w:sz w:val="20"/>
           <w:szCs w:val="20"/>
         </w:rPr>
-        <w:t xml:space="preserve">Tested product messaging across 26 countries through 128 structured tests, scaling 5 winning campaign groups and cutting UK cost per install by 21.5% while installs rose 30.2%</w:t>
+        <w:t xml:space="preserve">Cut UK cost per install by 21.5% while growing installs 30.2%, running 128 structured messaging tests across 26 countries and scaling 5 winning campaign groups</w:t>
       </w:r>
     </w:p>
     <w:p>
@@ -287,7 +287,7 @@
           <w:sz w:val="20"/>
           <w:szCs w:val="20"/>
         </w:rPr>
-        <w:t xml:space="preserve">Launched refreshed Personal and Earn product pages with Front-End Engineering and refreshed app-store content across 20 storefronts, building 20+ Custom Product Pages across 12 markets and 600+ keywords, with all regulated messaging cleared by Compliance</w:t>
+        <w:t xml:space="preserve">Led app-store content across 20 storefronts and relaunched the Personal and Earn product pages with Front-End Engineering, shipping 20+ Custom Product Pages across 12 markets and 600+ keywords, all cleared through Compliance</w:t>
       </w:r>
     </w:p>
     <w:p>

</xml_diff>

<commit_message>
Reframe BVNK CV as product marketing, with placeholders for missing results
Bullets now read as adoption, customer insight, enablement, lifecycle
comms and launches, with paid acquisition terms minimised. [ADD:]
placeholders mark four results still needed.

Co-Authored-By: Claude Opus 5.5 <noreply@anthropic.com>
Claude-Session: https://claude.ai/code/session_01Qg3JRGKeFtCXXeV9rGpzwA
</commit_message>
<xml_diff>
--- a/dist/Jessie-Chan-CV-bvnk-pmm.docx
+++ b/dist/Jessie-Chan-CV-bvnk-pmm.docx
@@ -52,7 +52,7 @@
           <w:sz w:val="20"/>
           <w:szCs w:val="20"/>
         </w:rPr>
-        <w:t xml:space="preserve">Fintech/crypto marketer owning regulated customer communications, client acquisition and go-to-market across retail, wealth and institutional products in 26 markets. I use AI to solve go-to-market problems, and build the automation, reporting, MCP and API integrations and internal bots the team runs on. I work directly with Compliance, Legal, Product and Engineering in a regulated environment, and bring a data-science research background.</w:t>
+        <w:t xml:space="preserve">Fintech/crypto marketer owning go-to-market, regulated customer communications and product adoption across retail, wealth and institutional products in 26 markets. I use AI to solve go-to-market problems, and build the automation, reporting, MCP and API integrations and internal bots the team runs on. I work directly with Compliance, Legal, Product and Engineering in a regulated environment, and bring a data-science research background.</w:t>
       </w:r>
     </w:p>
     <w:p>
@@ -155,7 +155,7 @@
           <w:sz w:val="20"/>
           <w:szCs w:val="20"/>
         </w:rPr>
-        <w:t xml:space="preserve">Converted 4 clients onto the loans product in Malaysia, shaping its go-to-market across competitor review, brand and tone, and KOL, affiliate and referral partnerships</w:t>
+        <w:t xml:space="preserve">Drove adoption of the loans product in Malaysia, converting 4 clients through a go-to-market plan covering competitor review, positioning, brand and tone, and KOL, affiliate and referral partnerships</w:t>
       </w:r>
     </w:p>
     <w:p>
@@ -199,7 +199,7 @@
           <w:sz w:val="20"/>
           <w:szCs w:val="20"/>
         </w:rPr>
-        <w:t xml:space="preserve">Increased email open rate by 10% by implementing API tools that translate CRM communications into local languages</w:t>
+        <w:t xml:space="preserve">Designed and launched a customer survey across 3 segments with 114 responses, using the findings to [ADD: what changed — e.g. reposition a product, prioritise a segment or campaign]</w:t>
       </w:r>
     </w:p>
     <w:p>
@@ -221,7 +221,7 @@
           <w:sz w:val="20"/>
           <w:szCs w:val="20"/>
         </w:rPr>
-        <w:t xml:space="preserve">Built the company's first in-house AI UGC production workflow, delivering 100+ video assets across TikTok and Google Ads, lifting CTR from 0.4% to 1.15% (+188%), cutting CPI from $25 to $6 (−76%) and production time by 75%</w:t>
+        <w:t xml:space="preserve">Equipped Institutional business development with a 100-operator prospect database, working with B2B Product Marketing on Institutional and Wealth projects, [ADD: result — e.g. X meetings booked or $X pipeline]</w:t>
       </w:r>
     </w:p>
     <w:p>
@@ -243,7 +243,7 @@
           <w:sz w:val="20"/>
           <w:szCs w:val="20"/>
         </w:rPr>
-        <w:t xml:space="preserve">Automated daily paid media reporting with Claude Code and led its launch as a company-wide Streamlit dashboard with Data Engineering and Security, saving the team ~10 hours a month</w:t>
+        <w:t xml:space="preserve">Localised CRM communications into [ADD: number] languages with API tools, increasing email open rate by 10%</w:t>
       </w:r>
     </w:p>
     <w:p>
@@ -265,7 +265,7 @@
           <w:sz w:val="20"/>
           <w:szCs w:val="20"/>
         </w:rPr>
-        <w:t xml:space="preserve">Cut UK cost per install by 21.5% while growing installs 30.2%, running 128 structured messaging tests across 26 countries and scaling 5 winning campaign groups</w:t>
+        <w:t xml:space="preserve">Launched refreshed Personal and Earn product pages and app-store content across 20 storefronts and 20+ Custom Product Pages in 12 markets, all cleared through Compliance, [ADD: result — e.g. store conversion up X%]</w:t>
       </w:r>
     </w:p>
     <w:p>
@@ -287,68 +287,7 @@
           <w:sz w:val="20"/>
           <w:szCs w:val="20"/>
         </w:rPr>
-        <w:t xml:space="preserve">Led app-store content across 20 storefronts and relaunched the Personal and Earn product pages with Front-End Engineering, shipping 20+ Custom Product Pages across 12 markets and 600+ keywords, all cleared through Compliance</w:t>
-      </w:r>
-    </w:p>
-    <w:p>
-      <w:pPr>
-        <w:tabs>
-          <w:tab w:val="right" w:pos="10466"/>
-        </w:tabs>
-        <w:spacing w:after="10" w:before="100"/>
-      </w:pPr>
-      <w:r>
-        <w:rPr>
-          <w:rFonts w:ascii="Calibri" w:cs="Calibri" w:eastAsia="Calibri" w:hAnsi="Calibri"/>
-          <w:b/>
-          <w:bCs/>
-          <w:i w:val="false"/>
-          <w:iCs w:val="false"/>
-          <w:sz w:val="20"/>
-          <w:szCs w:val="20"/>
-        </w:rPr>
-        <w:t xml:space="preserve">Performance Marketer</w:t>
-      </w:r>
-      <w:r>
-        <w:rPr>
-          <w:rFonts w:ascii="Calibri" w:cs="Calibri" w:eastAsia="Calibri" w:hAnsi="Calibri"/>
-          <w:b w:val="false"/>
-          <w:bCs w:val="false"/>
-          <w:i w:val="false"/>
-          <w:iCs w:val="false"/>
-          <w:sz w:val="20"/>
-          <w:szCs w:val="20"/>
-        </w:rPr>
-        <w:t xml:space="preserve">	</w:t>
-      </w:r>
-      <w:r>
-        <w:rPr>
-          <w:rFonts w:ascii="Calibri" w:cs="Calibri" w:eastAsia="Calibri" w:hAnsi="Calibri"/>
-          <w:b/>
-          <w:bCs/>
-          <w:i w:val="false"/>
-          <w:iCs w:val="false"/>
-          <w:sz w:val="20"/>
-          <w:szCs w:val="20"/>
-        </w:rPr>
-        <w:t xml:space="preserve">Feb 2025 – Apr 2026</w:t>
-      </w:r>
-    </w:p>
-    <w:p>
-      <w:pPr>
-        <w:spacing w:after="60"/>
-      </w:pPr>
-      <w:r>
-        <w:rPr>
-          <w:rFonts w:ascii="Calibri" w:cs="Calibri" w:eastAsia="Calibri" w:hAnsi="Calibri"/>
-          <w:b w:val="false"/>
-          <w:bCs w:val="false"/>
-          <w:i/>
-          <w:iCs/>
-          <w:sz w:val="20"/>
-          <w:szCs w:val="20"/>
-        </w:rPr>
-        <w:t xml:space="preserve">Malaberg, London, United Kingdom</w:t>
+        <w:t xml:space="preserve">Tested product messaging across 26 countries through 128 structured tests, scaling 5 winning campaign groups and cutting UK acquisition cost by 21.5% while volume rose 30.2%</w:t>
       </w:r>
     </w:p>
     <w:p>
@@ -370,7 +309,7 @@
           <w:sz w:val="20"/>
           <w:szCs w:val="20"/>
         </w:rPr>
-        <w:t xml:space="preserve">Led weekly content reviews with Compliance to clear regulated consumer-finance messaging across all channels</w:t>
+        <w:t xml:space="preserve">Automated daily performance reporting with Claude Code and led its launch as a company-wide Streamlit dashboard with Data Engineering and Security, saving the team ~10 hours a month</w:t>
       </w:r>
     </w:p>
     <w:p>
@@ -392,7 +331,68 @@
           <w:sz w:val="20"/>
           <w:szCs w:val="20"/>
         </w:rPr>
-        <w:t xml:space="preserve">Built a company-wide automated reporting pipeline on lead conversion, cutting daily report preparation from 30 min to almost immediate output</w:t>
+        <w:t xml:space="preserve">Built the company's first in-house AI content production workflow, delivering 100+ video assets, cutting production time by 75% and lifting CTR by 188%</w:t>
+      </w:r>
+    </w:p>
+    <w:p>
+      <w:pPr>
+        <w:tabs>
+          <w:tab w:val="right" w:pos="10466"/>
+        </w:tabs>
+        <w:spacing w:after="10" w:before="100"/>
+      </w:pPr>
+      <w:r>
+        <w:rPr>
+          <w:rFonts w:ascii="Calibri" w:cs="Calibri" w:eastAsia="Calibri" w:hAnsi="Calibri"/>
+          <w:b/>
+          <w:bCs/>
+          <w:i w:val="false"/>
+          <w:iCs w:val="false"/>
+          <w:sz w:val="20"/>
+          <w:szCs w:val="20"/>
+        </w:rPr>
+        <w:t xml:space="preserve">Performance Marketer</w:t>
+      </w:r>
+      <w:r>
+        <w:rPr>
+          <w:rFonts w:ascii="Calibri" w:cs="Calibri" w:eastAsia="Calibri" w:hAnsi="Calibri"/>
+          <w:b w:val="false"/>
+          <w:bCs w:val="false"/>
+          <w:i w:val="false"/>
+          <w:iCs w:val="false"/>
+          <w:sz w:val="20"/>
+          <w:szCs w:val="20"/>
+        </w:rPr>
+        <w:t xml:space="preserve">	</w:t>
+      </w:r>
+      <w:r>
+        <w:rPr>
+          <w:rFonts w:ascii="Calibri" w:cs="Calibri" w:eastAsia="Calibri" w:hAnsi="Calibri"/>
+          <w:b/>
+          <w:bCs/>
+          <w:i w:val="false"/>
+          <w:iCs w:val="false"/>
+          <w:sz w:val="20"/>
+          <w:szCs w:val="20"/>
+        </w:rPr>
+        <w:t xml:space="preserve">Feb 2025 – Apr 2026</w:t>
+      </w:r>
+    </w:p>
+    <w:p>
+      <w:pPr>
+        <w:spacing w:after="60"/>
+      </w:pPr>
+      <w:r>
+        <w:rPr>
+          <w:rFonts w:ascii="Calibri" w:cs="Calibri" w:eastAsia="Calibri" w:hAnsi="Calibri"/>
+          <w:b w:val="false"/>
+          <w:bCs w:val="false"/>
+          <w:i/>
+          <w:iCs/>
+          <w:sz w:val="20"/>
+          <w:szCs w:val="20"/>
+        </w:rPr>
+        <w:t xml:space="preserve">Malaberg, London, United Kingdom</w:t>
       </w:r>
     </w:p>
     <w:p>
@@ -414,7 +414,7 @@
           <w:sz w:val="20"/>
           <w:szCs w:val="20"/>
         </w:rPr>
-        <w:t xml:space="preserve">Increased daily conversions from 10 to 50+ (5x) by rebuilding landing and promotional pages in Figma and Photoshop, informed by funnel analysis in Power BI, Excel and Microsoft Clarity, increased funnel progression by 5%</w:t>
+        <w:t xml:space="preserve">Led weekly Compliance reviews of all customer-facing consumer-finance messaging across channels</w:t>
       </w:r>
     </w:p>
     <w:p>
@@ -436,7 +436,51 @@
           <w:sz w:val="20"/>
           <w:szCs w:val="20"/>
         </w:rPr>
-        <w:t xml:space="preserve">Managed £50k+ monthly paid budget with full accountability for efficiency, sustaining 120% ROAS</w:t>
+        <w:t xml:space="preserve">Increased daily conversions from 10 to 50+ (5x) by rebuilding landing and promotional pages in Figma and Photoshop, informed by funnel analysis in Power BI and Microsoft Clarity</w:t>
+      </w:r>
+    </w:p>
+    <w:p>
+      <w:pPr>
+        <w:pStyle w:val="ListParagraph"/>
+        <w:numPr>
+          <w:ilvl w:val="0"/>
+          <w:numId w:val="2"/>
+        </w:numPr>
+        <w:spacing w:after="50"/>
+      </w:pPr>
+      <w:r>
+        <w:rPr>
+          <w:rFonts w:ascii="Calibri" w:cs="Calibri" w:eastAsia="Calibri" w:hAnsi="Calibri"/>
+          <w:b w:val="false"/>
+          <w:bCs w:val="false"/>
+          <w:i w:val="false"/>
+          <w:iCs w:val="false"/>
+          <w:sz w:val="20"/>
+          <w:szCs w:val="20"/>
+        </w:rPr>
+        <w:t xml:space="preserve">Built a company-wide automated reporting pipeline on lead conversion, cutting daily report preparation from 30 min to almost immediate output</w:t>
+      </w:r>
+    </w:p>
+    <w:p>
+      <w:pPr>
+        <w:pStyle w:val="ListParagraph"/>
+        <w:numPr>
+          <w:ilvl w:val="0"/>
+          <w:numId w:val="2"/>
+        </w:numPr>
+        <w:spacing w:after="50"/>
+      </w:pPr>
+      <w:r>
+        <w:rPr>
+          <w:rFonts w:ascii="Calibri" w:cs="Calibri" w:eastAsia="Calibri" w:hAnsi="Calibri"/>
+          <w:b w:val="false"/>
+          <w:bCs w:val="false"/>
+          <w:i w:val="false"/>
+          <w:iCs w:val="false"/>
+          <w:sz w:val="20"/>
+          <w:szCs w:val="20"/>
+        </w:rPr>
+        <w:t xml:space="preserve">Managed £50k+ monthly budget with full accountability for efficiency, sustaining 120% ROAS</w:t>
       </w:r>
     </w:p>
     <w:p>
@@ -598,6 +642,54 @@
           <w:sz w:val="20"/>
           <w:szCs w:val="20"/>
         </w:rPr>
+        <w:t xml:space="preserve">Product marketing: </w:t>
+      </w:r>
+      <w:r>
+        <w:rPr>
+          <w:rFonts w:ascii="Calibri" w:cs="Calibri" w:eastAsia="Calibri" w:hAnsi="Calibri"/>
+          <w:b w:val="false"/>
+          <w:bCs w:val="false"/>
+          <w:i w:val="false"/>
+          <w:iCs w:val="false"/>
+          <w:sz w:val="20"/>
+          <w:szCs w:val="20"/>
+        </w:rPr>
+        <w:t xml:space="preserve">Go-to-market and launch planning, positioning and messaging, competitive analysis, lifecycle and CRM communications, product page and app-store content, KOL, affiliate and referral partnerships, financial promotions approval (UK FinProm, Adclear); </w:t>
+      </w:r>
+      <w:r>
+        <w:rPr>
+          <w:rFonts w:ascii="Calibri" w:cs="Calibri" w:eastAsia="Calibri" w:hAnsi="Calibri"/>
+          <w:b/>
+          <w:bCs/>
+          <w:i w:val="false"/>
+          <w:iCs w:val="false"/>
+          <w:sz w:val="20"/>
+          <w:szCs w:val="20"/>
+        </w:rPr>
+        <w:t xml:space="preserve">Customer insight: </w:t>
+      </w:r>
+      <w:r>
+        <w:rPr>
+          <w:rFonts w:ascii="Calibri" w:cs="Calibri" w:eastAsia="Calibri" w:hAnsi="Calibri"/>
+          <w:b w:val="false"/>
+          <w:bCs w:val="false"/>
+          <w:i w:val="false"/>
+          <w:iCs w:val="false"/>
+          <w:sz w:val="20"/>
+          <w:szCs w:val="20"/>
+        </w:rPr>
+        <w:t xml:space="preserve">Survey design and segmentation, customer and competitor research (Appfollow), funnel and cohort analysis, structured test design, Power BI, Excel, Microsoft Clarity, R, Python, SQL; </w:t>
+      </w:r>
+      <w:r>
+        <w:rPr>
+          <w:rFonts w:ascii="Calibri" w:cs="Calibri" w:eastAsia="Calibri" w:hAnsi="Calibri"/>
+          <w:b/>
+          <w:bCs/>
+          <w:i w:val="false"/>
+          <w:iCs w:val="false"/>
+          <w:sz w:val="20"/>
+          <w:szCs w:val="20"/>
+        </w:rPr>
         <w:t xml:space="preserve">AI &amp; automation: </w:t>
       </w:r>
       <w:r>
@@ -610,67 +702,19 @@
           <w:sz w:val="20"/>
           <w:szCs w:val="20"/>
         </w:rPr>
-        <w:t xml:space="preserve">Automation workflows (Claude Code, Cursor), MCP and API integrations (Windsor.ai), vibe-coded apps and bots (deployed on fly.io), AI UGC workflow design (avatar, voice, motion, video), tools: Runway, Jitter, Gemini, Seedance, Wan, Seeaudio, ElevenLabs; </w:t>
-      </w:r>
-      <w:r>
-        <w:rPr>
-          <w:rFonts w:ascii="Calibri" w:cs="Calibri" w:eastAsia="Calibri" w:hAnsi="Calibri"/>
-          <w:b/>
-          <w:bCs/>
-          <w:i w:val="false"/>
-          <w:iCs w:val="false"/>
-          <w:sz w:val="20"/>
-          <w:szCs w:val="20"/>
-        </w:rPr>
-        <w:t xml:space="preserve">Research &amp; insight: </w:t>
-      </w:r>
-      <w:r>
-        <w:rPr>
-          <w:rFonts w:ascii="Calibri" w:cs="Calibri" w:eastAsia="Calibri" w:hAnsi="Calibri"/>
-          <w:b w:val="false"/>
-          <w:bCs w:val="false"/>
-          <w:i w:val="false"/>
-          <w:iCs w:val="false"/>
-          <w:sz w:val="20"/>
-          <w:szCs w:val="20"/>
-        </w:rPr>
-        <w:t xml:space="preserve">Survey design and segmentation, customer research and prospecting, competitor research (Appfollow), funnel and cohort analysis, experimental test design, Power BI, Excel, Microsoft Clarity, R, Python, SQL; </w:t>
-      </w:r>
-      <w:r>
-        <w:rPr>
-          <w:rFonts w:ascii="Calibri" w:cs="Calibri" w:eastAsia="Calibri" w:hAnsi="Calibri"/>
-          <w:b/>
-          <w:bCs/>
-          <w:i w:val="false"/>
-          <w:iCs w:val="false"/>
-          <w:sz w:val="20"/>
-          <w:szCs w:val="20"/>
-        </w:rPr>
-        <w:t xml:space="preserve">Go-to-market: </w:t>
-      </w:r>
-      <w:r>
-        <w:rPr>
-          <w:rFonts w:ascii="Calibri" w:cs="Calibri" w:eastAsia="Calibri" w:hAnsi="Calibri"/>
-          <w:b w:val="false"/>
-          <w:bCs w:val="false"/>
-          <w:i w:val="false"/>
-          <w:iCs w:val="false"/>
-          <w:sz w:val="20"/>
-          <w:szCs w:val="20"/>
-        </w:rPr>
-        <w:t xml:space="preserve">Market entry planning, positioning and messaging, brand and tone, CRM and localised customer communications, app-store content, KOL, affiliate and referral partnerships, financial promotions approval (UK FinProm, Adclear); </w:t>
-      </w:r>
-      <w:r>
-        <w:rPr>
-          <w:rFonts w:ascii="Calibri" w:cs="Calibri" w:eastAsia="Calibri" w:hAnsi="Calibri"/>
-          <w:b/>
-          <w:bCs/>
-          <w:i w:val="false"/>
-          <w:iCs w:val="false"/>
-          <w:sz w:val="20"/>
-          <w:szCs w:val="20"/>
-        </w:rPr>
-        <w:t xml:space="preserve">Creative &amp; paid media: </w:t>
+        <w:t xml:space="preserve">Automation workflows (Claude Code, Cursor), MCP and API integrations (Windsor.ai), vibe-coded apps and bots (deployed on fly.io), AI content workflow design, tools: Runway, Jitter, Gemini, ElevenLabs; </w:t>
+      </w:r>
+      <w:r>
+        <w:rPr>
+          <w:rFonts w:ascii="Calibri" w:cs="Calibri" w:eastAsia="Calibri" w:hAnsi="Calibri"/>
+          <w:b/>
+          <w:bCs/>
+          <w:i w:val="false"/>
+          <w:iCs w:val="false"/>
+          <w:sz w:val="20"/>
+          <w:szCs w:val="20"/>
+        </w:rPr>
+        <w:t xml:space="preserve">Creative &amp; channels: </w:t>
       </w:r>
       <w:r>
         <w:rPr>

</xml_diff>

<commit_message>
Add the perps survey context and volume growth to the BVNK CV
Co-Authored-By: Claude Opus 5.5 <noreply@anthropic.com>
Claude-Session: https://claude.ai/code/session_01Qg3JRGKeFtCXXeV9rGpzwA
</commit_message>
<xml_diff>
--- a/dist/Jessie-Chan-CV-bvnk-pmm.docx
+++ b/dist/Jessie-Chan-CV-bvnk-pmm.docx
@@ -177,7 +177,7 @@
           <w:sz w:val="20"/>
           <w:szCs w:val="20"/>
         </w:rPr>
-        <w:t xml:space="preserve">Sourced 3 major high net worth clients by building an outreach channel of 80 crypto publishers</w:t>
+        <w:t xml:space="preserve">Ran voice-of-customer research on the perps platform, a 114-response survey across 3 segments on what users liked and disliked, feeding product and positioning as cumulative trading volume grew 5x from $100m (July) to $500m (September)</w:t>
       </w:r>
     </w:p>
     <w:p>
@@ -199,7 +199,7 @@
           <w:sz w:val="20"/>
           <w:szCs w:val="20"/>
         </w:rPr>
-        <w:t xml:space="preserve">Designed and launched a customer survey across 3 segments with 114 responses, using the findings to [ADD: what changed — e.g. reposition a product, prioritise a segment or campaign]</w:t>
+        <w:t xml:space="preserve">Sourced 3 major high net worth clients by building an outreach channel of 80 crypto publishers</w:t>
       </w:r>
     </w:p>
     <w:p>

</xml_diff>

<commit_message>
Apply Jessie's edited bullet list to the BVNK CV
24 CRM languages, 20+ leads, product page bullet removed.

Co-Authored-By: Claude Opus 5.5 <noreply@anthropic.com>
Claude-Session: https://claude.ai/code/session_01Qg3JRGKeFtCXXeV9rGpzwA
</commit_message>
<xml_diff>
--- a/dist/Jessie-Chan-CV-bvnk-pmm.docx
+++ b/dist/Jessie-Chan-CV-bvnk-pmm.docx
@@ -155,7 +155,7 @@
           <w:sz w:val="20"/>
           <w:szCs w:val="20"/>
         </w:rPr>
-        <w:t xml:space="preserve">Drove adoption of the loans product in Malaysia, converting 4 clients through a go-to-market plan covering competitor review, positioning, brand and tone, and KOL, affiliate and referral partnerships</w:t>
+        <w:t xml:space="preserve">Converted 4 clients onto the loans product in Malaysia, developing its go-to-market across competitor review, brand and tone, and KOL, affiliate and referral partnerships</w:t>
       </w:r>
     </w:p>
     <w:p>
@@ -177,7 +177,7 @@
           <w:sz w:val="20"/>
           <w:szCs w:val="20"/>
         </w:rPr>
-        <w:t xml:space="preserve">Grew cumulative perps trading volume 5x, from $100m to $500m in two months, with voice-of-customer research surveying active, inactive and churned users to improve product experience</w:t>
+        <w:t xml:space="preserve">Sourced 3 major high net worth clients by building an outreach channel of 80 crypto publishers</w:t>
       </w:r>
     </w:p>
     <w:p>
@@ -199,7 +199,7 @@
           <w:sz w:val="20"/>
           <w:szCs w:val="20"/>
         </w:rPr>
-        <w:t xml:space="preserve">Sourced 3 major high net worth clients by building an outreach channel of 80 crypto publishers</w:t>
+        <w:t xml:space="preserve">Grew cumulative perps trading volume 5x, from $100m to $500m in two months, with voice-of-customer research surveying active, inactive and churned users to improve product experience</w:t>
       </w:r>
     </w:p>
     <w:p>
@@ -221,7 +221,7 @@
           <w:sz w:val="20"/>
           <w:szCs w:val="20"/>
         </w:rPr>
-        <w:t xml:space="preserve">Generated 20 active leads for Institutional business development by building a 100-operator prospect database, working with B2B Product Marketing on Institutional and Wealth projects</w:t>
+        <w:t xml:space="preserve">Generated 20+ active leads for Institutional business development by building a 100-operator prospect database, working with B2B Product Marketing on Institutional and Wealth projects</w:t>
       </w:r>
     </w:p>
     <w:p>
@@ -243,29 +243,7 @@
           <w:sz w:val="20"/>
           <w:szCs w:val="20"/>
         </w:rPr>
-        <w:t xml:space="preserve">Localised CRM communications into [ADD: number] languages with API tools, increasing email open rate by 10%</w:t>
-      </w:r>
-    </w:p>
-    <w:p>
-      <w:pPr>
-        <w:pStyle w:val="ListParagraph"/>
-        <w:numPr>
-          <w:ilvl w:val="0"/>
-          <w:numId w:val="2"/>
-        </w:numPr>
-        <w:spacing w:after="50"/>
-      </w:pPr>
-      <w:r>
-        <w:rPr>
-          <w:rFonts w:ascii="Calibri" w:cs="Calibri" w:eastAsia="Calibri" w:hAnsi="Calibri"/>
-          <w:b w:val="false"/>
-          <w:bCs w:val="false"/>
-          <w:i w:val="false"/>
-          <w:iCs w:val="false"/>
-          <w:sz w:val="20"/>
-          <w:szCs w:val="20"/>
-        </w:rPr>
-        <w:t xml:space="preserve">Launched refreshed Personal and Earn product pages and app-store content across 20 storefronts and 20+ Custom Product Pages in 12 markets, all cleared through Compliance, [ADD: result — e.g. store conversion up X%]</w:t>
+        <w:t xml:space="preserve">Localised CRM communications into 24 languages with API tools, increasing email open rate by 10%</w:t>
       </w:r>
     </w:p>
     <w:p>

</xml_diff>

<commit_message>
Lock Jessie's final BVNK CV and match the cover letter to it
CV data now mirrors her final edit verbatim. Cover letter rewritten
against it, with a why-BVNK paragraph on Europe under MiCAR and
Southeast Asia cross-border payments.

Co-Authored-By: Claude Opus 5.5 <noreply@anthropic.com>
Claude-Session: https://claude.ai/code/session_01Qg3JRGKeFtCXXeV9rGpzwA
</commit_message>
<xml_diff>
--- a/dist/Jessie-Chan-CV-bvnk-pmm.docx
+++ b/dist/Jessie-Chan-CV-bvnk-pmm.docx
@@ -92,7 +92,7 @@
           <w:sz w:val="20"/>
           <w:szCs w:val="20"/>
         </w:rPr>
-        <w:t xml:space="preserve">Growth Marketing Intern</w:t>
+        <w:t xml:space="preserve">Institutional and Retail Growth Marketing Intern</w:t>
       </w:r>
       <w:r>
         <w:rPr>
@@ -148,14 +148,14 @@
       <w:r>
         <w:rPr>
           <w:rFonts w:ascii="Calibri" w:cs="Calibri" w:eastAsia="Calibri" w:hAnsi="Calibri"/>
-          <w:b/>
-          <w:bCs/>
-          <w:i w:val="false"/>
-          <w:iCs w:val="false"/>
-          <w:sz w:val="20"/>
-          <w:szCs w:val="20"/>
-        </w:rPr>
-        <w:t xml:space="preserve">Converted 4 clients onto the loans product in Malaysia, developing its go-to-market across competitor review, brand and tone, and KOL, affiliate and referral partnerships, and establishing a compliance review process for the new market</w:t>
+          <w:b w:val="false"/>
+          <w:bCs w:val="false"/>
+          <w:i w:val="false"/>
+          <w:iCs w:val="false"/>
+          <w:sz w:val="20"/>
+          <w:szCs w:val="20"/>
+        </w:rPr>
+        <w:t xml:space="preserve">Grew cumulative perps trading volume 5x, from $100m to $500m in two months, with voice-of-customer research surveying active, inactive and churned users to improve product experience</w:t>
       </w:r>
     </w:p>
     <w:p>
@@ -177,7 +177,7 @@
           <w:sz w:val="20"/>
           <w:szCs w:val="20"/>
         </w:rPr>
-        <w:t xml:space="preserve">Sourced 3 major high net worth clients by identifying an acquisition opportunity during the MiCAR transition, building an 80-publisher contact list with AI and running the outreach</w:t>
+        <w:t xml:space="preserve">Converted 4 clients onto the loans product in Malaysia, developing its go-to-market across competitor review, brand and tone, and KOL, affiliate and referral partnerships, and establishing a compliance review process for the new market</w:t>
       </w:r>
     </w:p>
     <w:p>
@@ -199,7 +199,7 @@
           <w:sz w:val="20"/>
           <w:szCs w:val="20"/>
         </w:rPr>
-        <w:t xml:space="preserve">Grew cumulative perps trading volume 5x, from $100m to $500m in two months, with voice-of-customer research surveying active, inactive and churned users to improve product experience</w:t>
+        <w:t xml:space="preserve">Sourced 3 major high net worth clients by identifying an acquisition opportunity during the MiCAR transition, building an 80-publisher contact list with AI and running the outreach</w:t>
       </w:r>
     </w:p>
     <w:p>
@@ -392,7 +392,7 @@
           <w:sz w:val="20"/>
           <w:szCs w:val="20"/>
         </w:rPr>
-        <w:t xml:space="preserve">Led weekly Compliance reviews of all customer-facing consumer-finance messaging across channels</w:t>
+        <w:t xml:space="preserve">Built a company-wide automated reporting pipeline on lead conversion, cutting daily report preparation from 30 min to almost immediate output</w:t>
       </w:r>
     </w:p>
     <w:p>
@@ -414,7 +414,7 @@
           <w:sz w:val="20"/>
           <w:szCs w:val="20"/>
         </w:rPr>
-        <w:t xml:space="preserve">Increased daily conversions from 10 to 50+ (5x) by rebuilding landing and promotional pages in Figma and Photoshop, informed by funnel analysis in Power BI and Microsoft Clarity</w:t>
+        <w:t xml:space="preserve">Increased daily conversions from 10 to 50+ (5x) by rebuilding landing and promotional pages in Figma and Photoshop, informed by funnel analysis in Power BI, Excel and Microsoft Clarity, increased funnel progression by 5%</w:t>
       </w:r>
     </w:p>
     <w:p>
@@ -436,29 +436,7 @@
           <w:sz w:val="20"/>
           <w:szCs w:val="20"/>
         </w:rPr>
-        <w:t xml:space="preserve">Built a company-wide automated reporting pipeline on lead conversion, cutting daily report preparation from 30 min to almost immediate output</w:t>
-      </w:r>
-    </w:p>
-    <w:p>
-      <w:pPr>
-        <w:pStyle w:val="ListParagraph"/>
-        <w:numPr>
-          <w:ilvl w:val="0"/>
-          <w:numId w:val="2"/>
-        </w:numPr>
-        <w:spacing w:after="50"/>
-      </w:pPr>
-      <w:r>
-        <w:rPr>
-          <w:rFonts w:ascii="Calibri" w:cs="Calibri" w:eastAsia="Calibri" w:hAnsi="Calibri"/>
-          <w:b w:val="false"/>
-          <w:bCs w:val="false"/>
-          <w:i w:val="false"/>
-          <w:iCs w:val="false"/>
-          <w:sz w:val="20"/>
-          <w:szCs w:val="20"/>
-        </w:rPr>
-        <w:t xml:space="preserve">Managed £50k+ monthly budget with full accountability for efficiency, sustaining 120% ROAS</w:t>
+        <w:t xml:space="preserve">Managed £50k+ monthly paid budget with full accountability for efficiency, sustaining 120% ROAS</w:t>
       </w:r>
     </w:p>
     <w:p>

</xml_diff>

<commit_message>
Apply review fixes to the BVNK cover letter and CV
Cover letter: her draft edited in place, local-licence line replaced,
systems paragraph restored, sales sentence and stronger opening added.
Now also exported as HTML for pasting into Google Docs.

CV: perps bullet gains the 12% retention result, Malaysia bullet gains
4 HNW clients within 1 month and 'leading'.

Co-Authored-By: Claude Opus 5.5 <noreply@anthropic.com>
Claude-Session: https://claude.ai/code/session_01Qg3JRGKeFtCXXeV9rGpzwA
</commit_message>
<xml_diff>
--- a/dist/Jessie-Chan-CV-bvnk-pmm.docx
+++ b/dist/Jessie-Chan-CV-bvnk-pmm.docx
@@ -155,7 +155,7 @@
           <w:sz w:val="20"/>
           <w:szCs w:val="20"/>
         </w:rPr>
-        <w:t xml:space="preserve">Grew cumulative perps trading volume 5x, from $100m to $500m in two months, with voice-of-customer research surveying active, inactive and churned users to improve product experience</w:t>
+        <w:t xml:space="preserve">Grew cumulative perps trading volume 5x, from $100m to $500m in two months, and user retention by 12% through voice-of-customer research with active, inactive and churned users</w:t>
       </w:r>
     </w:p>
     <w:p>
@@ -177,7 +177,7 @@
           <w:sz w:val="20"/>
           <w:szCs w:val="20"/>
         </w:rPr>
-        <w:t xml:space="preserve">Converted 4 clients onto the loans product in Malaysia, developing its go-to-market across competitor review, brand and tone, and KOL, affiliate and referral partnerships, and establishing a compliance review process for the new market</w:t>
+        <w:t xml:space="preserve">Converted 4 high net worth clients onto the loans product in Malaysia within 1 month of launch, leading its go-to-market across competitor review, brand and tone, and KOL, affiliate and referral partnerships, and establishing a compliance review process for the new market</w:t>
       </w:r>
     </w:p>
     <w:p>

</xml_diff>

<commit_message>
Refresh the BVNK CV with the rules and facts established since
Co-Authored-By: Claude Opus 5.5 <noreply@anthropic.com>
Claude-Session: https://claude.ai/code/session_01Qg3JRGKeFtCXXeV9rGpzwA
</commit_message>
<xml_diff>
--- a/dist/Jessie-Chan-CV-bvnk-pmm.docx
+++ b/dist/Jessie-Chan-CV-bvnk-pmm.docx
@@ -155,7 +155,7 @@
           <w:sz w:val="20"/>
           <w:szCs w:val="20"/>
         </w:rPr>
-        <w:t xml:space="preserve">Grew cumulative perps trading volume 5x, from $100m to $500m in two months, and user retention by 12% through voice-of-customer research with active, inactive and churned users</w:t>
+        <w:t xml:space="preserve">Grew cumulative perps trading volume from $100m to $500m (5x) in two months and increased user retention by 12% by leading voice-of-customer research with active, inactive and churned users and making the product and risk explainer persistent</w:t>
       </w:r>
     </w:p>
     <w:p>
@@ -177,7 +177,7 @@
           <w:sz w:val="20"/>
           <w:szCs w:val="20"/>
         </w:rPr>
-        <w:t xml:space="preserve">Converted 4 high net worth clients onto the loans product in Malaysia within 1 month of launch, leading its go-to-market across competitor review, brand and tone, and KOL, affiliate and referral partnerships, and establishing a compliance review process for the new market</w:t>
+        <w:t xml:space="preserve">Converted 4 high net worth clients onto the loans product in Malaysia within 1 month of launch by leading its go-to-market across competitor review, brand and tone, and KOL, affiliate and referral partnerships, and establishing a compliance review process for the new market</w:t>
       </w:r>
     </w:p>
     <w:p>
@@ -199,7 +199,7 @@
           <w:sz w:val="20"/>
           <w:szCs w:val="20"/>
         </w:rPr>
-        <w:t xml:space="preserve">Sourced 3 major high net worth clients by identifying an acquisition opportunity during the MiCAR transition, building an 80-publisher contact list with AI and running the outreach</w:t>
+        <w:t xml:space="preserve">Sourced 3 major high net worth clients by spotting that a major exchange was losing access to European clients under MiCAR and building an 80-publisher contact list with AI</w:t>
       </w:r>
     </w:p>
     <w:p>
@@ -221,7 +221,7 @@
           <w:sz w:val="20"/>
           <w:szCs w:val="20"/>
         </w:rPr>
-        <w:t xml:space="preserve">Generated 20+ active leads for Institutional business development by building a 100-operator prospect database, working with B2B Product Marketing on Institutional and Wealth projects</w:t>
+        <w:t xml:space="preserve">Generated 20+ active leads for Institutional business development by building a 100-operator prospect database, partnering with B2B Product Marketing on Institutional and Wealth projects</w:t>
       </w:r>
     </w:p>
     <w:p>
@@ -243,7 +243,7 @@
           <w:sz w:val="20"/>
           <w:szCs w:val="20"/>
         </w:rPr>
-        <w:t xml:space="preserve">Localised CRM communications into 24 languages with API tools, increasing email open rate by 10%</w:t>
+        <w:t xml:space="preserve">Increased email open rate by 10% by localising CRM communications into 24 languages with built-in CRM APIs</w:t>
       </w:r>
     </w:p>
     <w:p>
@@ -265,7 +265,7 @@
           <w:sz w:val="20"/>
           <w:szCs w:val="20"/>
         </w:rPr>
-        <w:t xml:space="preserve">Tested product messaging across 26 countries through 128 structured tests, scaling 5 winning campaign groups and cutting UK acquisition cost by 21.5% while volume rose 30.2%</w:t>
+        <w:t xml:space="preserve">Drove 600+ installs in the first 7 days of the Earn relaunch by recreating outdated creator assets with AI video after the rebrand</w:t>
       </w:r>
     </w:p>
     <w:p>
@@ -287,7 +287,7 @@
           <w:sz w:val="20"/>
           <w:szCs w:val="20"/>
         </w:rPr>
-        <w:t xml:space="preserve">Automated daily performance reporting with Claude Code and led its launch as a company-wide Streamlit dashboard with Data Engineering and Security, saving the team ~10 hours a month</w:t>
+        <w:t xml:space="preserve">Increased CTR from 0.4% to 1.15% (+188%) and cut production time by 75% by building the company's first in-house AI content production workflow, delivering 100+ video assets</w:t>
       </w:r>
     </w:p>
     <w:p>
@@ -309,68 +309,7 @@
           <w:sz w:val="20"/>
           <w:szCs w:val="20"/>
         </w:rPr>
-        <w:t xml:space="preserve">Built the company's first in-house AI content production workflow, delivering 100+ video assets, cutting production time by 75% and lifting CTR by 188%</w:t>
-      </w:r>
-    </w:p>
-    <w:p>
-      <w:pPr>
-        <w:tabs>
-          <w:tab w:val="right" w:pos="10466"/>
-        </w:tabs>
-        <w:spacing w:after="10" w:before="100"/>
-      </w:pPr>
-      <w:r>
-        <w:rPr>
-          <w:rFonts w:ascii="Calibri" w:cs="Calibri" w:eastAsia="Calibri" w:hAnsi="Calibri"/>
-          <w:b/>
-          <w:bCs/>
-          <w:i w:val="false"/>
-          <w:iCs w:val="false"/>
-          <w:sz w:val="20"/>
-          <w:szCs w:val="20"/>
-        </w:rPr>
-        <w:t xml:space="preserve">Performance Marketer</w:t>
-      </w:r>
-      <w:r>
-        <w:rPr>
-          <w:rFonts w:ascii="Calibri" w:cs="Calibri" w:eastAsia="Calibri" w:hAnsi="Calibri"/>
-          <w:b w:val="false"/>
-          <w:bCs w:val="false"/>
-          <w:i w:val="false"/>
-          <w:iCs w:val="false"/>
-          <w:sz w:val="20"/>
-          <w:szCs w:val="20"/>
-        </w:rPr>
-        <w:t xml:space="preserve">	</w:t>
-      </w:r>
-      <w:r>
-        <w:rPr>
-          <w:rFonts w:ascii="Calibri" w:cs="Calibri" w:eastAsia="Calibri" w:hAnsi="Calibri"/>
-          <w:b/>
-          <w:bCs/>
-          <w:i w:val="false"/>
-          <w:iCs w:val="false"/>
-          <w:sz w:val="20"/>
-          <w:szCs w:val="20"/>
-        </w:rPr>
-        <w:t xml:space="preserve">Feb 2025 – Apr 2026</w:t>
-      </w:r>
-    </w:p>
-    <w:p>
-      <w:pPr>
-        <w:spacing w:after="60"/>
-      </w:pPr>
-      <w:r>
-        <w:rPr>
-          <w:rFonts w:ascii="Calibri" w:cs="Calibri" w:eastAsia="Calibri" w:hAnsi="Calibri"/>
-          <w:b w:val="false"/>
-          <w:bCs w:val="false"/>
-          <w:i/>
-          <w:iCs/>
-          <w:sz w:val="20"/>
-          <w:szCs w:val="20"/>
-        </w:rPr>
-        <w:t xml:space="preserve">Malaberg, London, United Kingdom</w:t>
+        <w:t xml:space="preserve">Saved the team ~10 hours a month by automating daily performance reporting with Claude Code and MCP connectors, and led its launch as a company-wide Streamlit dashboard with Data Engineering and Security</w:t>
       </w:r>
     </w:p>
     <w:p>
@@ -392,7 +331,68 @@
           <w:sz w:val="20"/>
           <w:szCs w:val="20"/>
         </w:rPr>
-        <w:t xml:space="preserve">Built a company-wide automated reporting pipeline on lead conversion, cutting daily report preparation from 30 min to almost immediate output</w:t>
+        <w:t xml:space="preserve">Cut UK acquisition cost by 21.5% while volume rose 30.2% by running 128 structured messaging tests across 26 countries and scaling 5 winning campaign groups</w:t>
+      </w:r>
+    </w:p>
+    <w:p>
+      <w:pPr>
+        <w:tabs>
+          <w:tab w:val="right" w:pos="10466"/>
+        </w:tabs>
+        <w:spacing w:after="10" w:before="100"/>
+      </w:pPr>
+      <w:r>
+        <w:rPr>
+          <w:rFonts w:ascii="Calibri" w:cs="Calibri" w:eastAsia="Calibri" w:hAnsi="Calibri"/>
+          <w:b/>
+          <w:bCs/>
+          <w:i w:val="false"/>
+          <w:iCs w:val="false"/>
+          <w:sz w:val="20"/>
+          <w:szCs w:val="20"/>
+        </w:rPr>
+        <w:t xml:space="preserve">Performance Marketer</w:t>
+      </w:r>
+      <w:r>
+        <w:rPr>
+          <w:rFonts w:ascii="Calibri" w:cs="Calibri" w:eastAsia="Calibri" w:hAnsi="Calibri"/>
+          <w:b w:val="false"/>
+          <w:bCs w:val="false"/>
+          <w:i w:val="false"/>
+          <w:iCs w:val="false"/>
+          <w:sz w:val="20"/>
+          <w:szCs w:val="20"/>
+        </w:rPr>
+        <w:t xml:space="preserve">	</w:t>
+      </w:r>
+      <w:r>
+        <w:rPr>
+          <w:rFonts w:ascii="Calibri" w:cs="Calibri" w:eastAsia="Calibri" w:hAnsi="Calibri"/>
+          <w:b/>
+          <w:bCs/>
+          <w:i w:val="false"/>
+          <w:iCs w:val="false"/>
+          <w:sz w:val="20"/>
+          <w:szCs w:val="20"/>
+        </w:rPr>
+        <w:t xml:space="preserve">Feb 2025 – Apr 2026</w:t>
+      </w:r>
+    </w:p>
+    <w:p>
+      <w:pPr>
+        <w:spacing w:after="60"/>
+      </w:pPr>
+      <w:r>
+        <w:rPr>
+          <w:rFonts w:ascii="Calibri" w:cs="Calibri" w:eastAsia="Calibri" w:hAnsi="Calibri"/>
+          <w:b w:val="false"/>
+          <w:bCs w:val="false"/>
+          <w:i/>
+          <w:iCs/>
+          <w:sz w:val="20"/>
+          <w:szCs w:val="20"/>
+        </w:rPr>
+        <w:t xml:space="preserve">Malaberg, London, United Kingdom</w:t>
       </w:r>
     </w:p>
     <w:p>
@@ -414,7 +414,7 @@
           <w:sz w:val="20"/>
           <w:szCs w:val="20"/>
         </w:rPr>
-        <w:t xml:space="preserve">Increased daily conversions from 10 to 50+ (5x) by rebuilding landing and promotional pages in Figma and Photoshop, informed by funnel analysis in Power BI, Excel and Microsoft Clarity, increased funnel progression by 5%</w:t>
+        <w:t xml:space="preserve">Increased daily conversions from 10 to 50+ (5x) and funnel progression by 5% by rebuilding landing and promotional pages in Figma and Photoshop, informed by funnel analysis in Power BI, Excel and Microsoft Clarity</w:t>
       </w:r>
     </w:p>
     <w:p>
@@ -436,7 +436,29 @@
           <w:sz w:val="20"/>
           <w:szCs w:val="20"/>
         </w:rPr>
-        <w:t xml:space="preserve">Managed £50k+ monthly paid budget, sustaining 120% ROAS</w:t>
+        <w:t xml:space="preserve">Cut daily report preparation from 30 min to near-instant by building a company-wide automated reporting pipeline on lead conversion</w:t>
+      </w:r>
+    </w:p>
+    <w:p>
+      <w:pPr>
+        <w:pStyle w:val="ListParagraph"/>
+        <w:numPr>
+          <w:ilvl w:val="0"/>
+          <w:numId w:val="2"/>
+        </w:numPr>
+        <w:spacing w:after="50"/>
+      </w:pPr>
+      <w:r>
+        <w:rPr>
+          <w:rFonts w:ascii="Calibri" w:cs="Calibri" w:eastAsia="Calibri" w:hAnsi="Calibri"/>
+          <w:b w:val="false"/>
+          <w:bCs w:val="false"/>
+          <w:i w:val="false"/>
+          <w:iCs w:val="false"/>
+          <w:sz w:val="20"/>
+          <w:szCs w:val="20"/>
+        </w:rPr>
+        <w:t xml:space="preserve">Sustained 120% ROAS while managing £50k+ monthly paid budget</w:t>
       </w:r>
     </w:p>
     <w:p>
@@ -610,8 +632,13 @@
           <w:sz w:val="20"/>
           <w:szCs w:val="20"/>
         </w:rPr>
-        <w:t xml:space="preserve">Go-to-market and launch planning, positioning and messaging, competitive analysis, lifecycle and CRM communications, product page and app-store content, KOL, affiliate and referral partnerships, financial promotions approval (UK FinProm, Adclear); </w:t>
-      </w:r>
+        <w:t xml:space="preserve">Go-to-market, product launches, product adoption, positioning and messaging, competitive analysis, customer communications, lifecycle and CRM marketing</w:t>
+      </w:r>
+    </w:p>
+    <w:p>
+      <w:pPr>
+        <w:spacing w:after="60"/>
+      </w:pPr>
       <w:r>
         <w:rPr>
           <w:rFonts w:ascii="Calibri" w:cs="Calibri" w:eastAsia="Calibri" w:hAnsi="Calibri"/>
@@ -634,8 +661,42 @@
           <w:sz w:val="20"/>
           <w:szCs w:val="20"/>
         </w:rPr>
-        <w:t xml:space="preserve">Survey design and segmentation, customer and competitor research (Appfollow), funnel and cohort analysis, structured test design, Power BI, Excel, Microsoft Clarity, R, Python, SQL; </w:t>
-      </w:r>
+        <w:t xml:space="preserve">Voice-of-customer research, survey design and segmentation, churn analysis, funnel and cohort analysis, A/B testing</w:t>
+      </w:r>
+    </w:p>
+    <w:p>
+      <w:pPr>
+        <w:spacing w:after="60"/>
+      </w:pPr>
+      <w:r>
+        <w:rPr>
+          <w:rFonts w:ascii="Calibri" w:cs="Calibri" w:eastAsia="Calibri" w:hAnsi="Calibri"/>
+          <w:b/>
+          <w:bCs/>
+          <w:i w:val="false"/>
+          <w:iCs w:val="false"/>
+          <w:sz w:val="20"/>
+          <w:szCs w:val="20"/>
+        </w:rPr>
+        <w:t xml:space="preserve">Compliance: </w:t>
+      </w:r>
+      <w:r>
+        <w:rPr>
+          <w:rFonts w:ascii="Calibri" w:cs="Calibri" w:eastAsia="Calibri" w:hAnsi="Calibri"/>
+          <w:b w:val="false"/>
+          <w:bCs w:val="false"/>
+          <w:i w:val="false"/>
+          <w:iCs w:val="false"/>
+          <w:sz w:val="20"/>
+          <w:szCs w:val="20"/>
+        </w:rPr>
+        <w:t xml:space="preserve">Financial promotions approval (UK FinProm, Adclear), new-market compliance review, regulated messaging with Legal and Compliance</w:t>
+      </w:r>
+    </w:p>
+    <w:p>
+      <w:pPr>
+        <w:spacing w:after="60"/>
+      </w:pPr>
       <w:r>
         <w:rPr>
           <w:rFonts w:ascii="Calibri" w:cs="Calibri" w:eastAsia="Calibri" w:hAnsi="Calibri"/>
@@ -658,56 +719,42 @@
           <w:sz w:val="20"/>
           <w:szCs w:val="20"/>
         </w:rPr>
-        <w:t xml:space="preserve">Automation workflows (Claude Code, Cursor), MCP and API integrations (Windsor.ai), vibe-coded apps and bots (deployed on fly.io), AI content workflow design, tools: Runway, Jitter, Gemini, ElevenLabs; </w:t>
-      </w:r>
-      <w:r>
-        <w:rPr>
-          <w:rFonts w:ascii="Calibri" w:cs="Calibri" w:eastAsia="Calibri" w:hAnsi="Calibri"/>
-          <w:b/>
-          <w:bCs/>
-          <w:i w:val="false"/>
-          <w:iCs w:val="false"/>
-          <w:sz w:val="20"/>
-          <w:szCs w:val="20"/>
-        </w:rPr>
-        <w:t xml:space="preserve">Creative &amp; channels: </w:t>
-      </w:r>
-      <w:r>
-        <w:rPr>
-          <w:rFonts w:ascii="Calibri" w:cs="Calibri" w:eastAsia="Calibri" w:hAnsi="Calibri"/>
-          <w:b w:val="false"/>
-          <w:bCs w:val="false"/>
-          <w:i w:val="false"/>
-          <w:iCs w:val="false"/>
-          <w:sz w:val="20"/>
-          <w:szCs w:val="20"/>
-        </w:rPr>
-        <w:t xml:space="preserve">Creative briefing and direction, agency and partner management, Figma, Photoshop, Apple Search Ads, Google Ads, Meta, TikTok, LinkedIn; </w:t>
-      </w:r>
-      <w:r>
-        <w:rPr>
-          <w:rFonts w:ascii="Calibri" w:cs="Calibri" w:eastAsia="Calibri" w:hAnsi="Calibri"/>
-          <w:b/>
-          <w:bCs/>
-          <w:i w:val="false"/>
-          <w:iCs w:val="false"/>
-          <w:sz w:val="20"/>
-          <w:szCs w:val="20"/>
-        </w:rPr>
-        <w:t xml:space="preserve">Personal interest: </w:t>
-      </w:r>
-      <w:r>
-        <w:rPr>
-          <w:rFonts w:ascii="Calibri" w:cs="Calibri" w:eastAsia="Calibri" w:hAnsi="Calibri"/>
-          <w:b w:val="false"/>
-          <w:bCs w:val="false"/>
-          <w:i w:val="false"/>
-          <w:iCs w:val="false"/>
-          <w:sz w:val="20"/>
-          <w:szCs w:val="20"/>
-        </w:rPr>
-        <w:t xml:space="preserve">Digital assets, business psychology, languages, martial arts, weightlifting; </w:t>
-      </w:r>
+        <w:t xml:space="preserve">Claude Code, Cursor, LLMs, MCP and API integrations (Windsor.ai), AI content production, automated dashboards (Streamlit)</w:t>
+      </w:r>
+    </w:p>
+    <w:p>
+      <w:pPr>
+        <w:spacing w:after="60"/>
+      </w:pPr>
+      <w:r>
+        <w:rPr>
+          <w:rFonts w:ascii="Calibri" w:cs="Calibri" w:eastAsia="Calibri" w:hAnsi="Calibri"/>
+          <w:b/>
+          <w:bCs/>
+          <w:i w:val="false"/>
+          <w:iCs w:val="false"/>
+          <w:sz w:val="20"/>
+          <w:szCs w:val="20"/>
+        </w:rPr>
+        <w:t xml:space="preserve">Tools: </w:t>
+      </w:r>
+      <w:r>
+        <w:rPr>
+          <w:rFonts w:ascii="Calibri" w:cs="Calibri" w:eastAsia="Calibri" w:hAnsi="Calibri"/>
+          <w:b w:val="false"/>
+          <w:bCs w:val="false"/>
+          <w:i w:val="false"/>
+          <w:iCs w:val="false"/>
+          <w:sz w:val="20"/>
+          <w:szCs w:val="20"/>
+        </w:rPr>
+        <w:t xml:space="preserve">Power BI, Excel, Microsoft Clarity, SQL, Python, R, Figma, Photoshop, Apple Search Ads, Google Ads, Meta, TikTok, LinkedIn</w:t>
+      </w:r>
+    </w:p>
+    <w:p>
+      <w:pPr>
+        <w:spacing w:after="60"/>
+      </w:pPr>
       <w:r>
         <w:rPr>
           <w:rFonts w:ascii="Calibri" w:cs="Calibri" w:eastAsia="Calibri" w:hAnsi="Calibri"/>

</xml_diff>